<commit_message>
Refresh the notebook with the corrected-scene rerun numbers
</commit_message>
<xml_diff>
--- a/paper/CENIC_working_notebook.docx
+++ b/paper/CENIC_working_notebook.docx
@@ -859,7 +859,7 @@
         <w:pStyle w:val="ListBullet"/>
       </w:pPr>
       <w:r>
-        <w:t>Passthrough / ejection: a body moving 2.8 cm per step with a 2.5 cm radius sees its first contact past its centre and is launched (fixed ICF at 10 ms ejects 1.6 % on hard clutter; B6).</w:t>
+        <w:t>Passthrough / ejection: a body moving 2.8 cm per step with a 2.5 cm radius sees its first contact past its centre and can be launched — the mechanism behind the retired pre-fix ejections; on the corrected scene no arm ejects at any setting (B6).</w:t>
       </w:r>
     </w:p>
     <w:p>
@@ -1949,7 +1949,7 @@
         <w:pStyle w:val="ListBullet"/>
       </w:pPr>
       <w:r>
-        <w:t>MuJoCo fixed 10 ms: 0.73 at 10³, then 5.7, 57, 572, 5719, 57,188 — ∝ k past the clamp: it realizes at most ~10³ N/m. Fixed 1 ms: 0.73, 0.98, 0.98, 6.8, 68, 681 — realizes up to 10⁵.</w:t>
+        <w:t>MuJoCo fixed 10 ms: 1.00 at 10³, then 5.7, 57, 572, 5719, 57,188 — ∝ k past the clamp: it realizes at most ~10³ N/m. Fixed 1 ms: 1.00, 1.29, 0.98, 6.8, 68, 681 — realizes up to 10⁵.</w:t>
       </w:r>
     </w:p>
     <w:p>
@@ -1957,7 +1957,7 @@
         <w:pStyle w:val="ListBullet"/>
       </w:pPr>
       <w:r>
-        <w:t>MuJoCo error control ε = 1e-3: 0.73, 1.68, 16.8, 168, 1678, 16,782 — the controller's steps (~5 ms) sit above the clamp for k ≥ 10⁴ and the softening is invisible to a position norm (the clamped contact is self-consistent). ε = 1e-5 recovers k = 10⁵ (1.2) and then floors where fixed 1 ms does.</w:t>
+        <w:t>MuJoCo error control ε = 1e-3: 1.00, 1.68, 16.8, 168, 1678, 16,782 — the controller's steps (~5 ms) sit above the clamp for k ≥ 10⁴ and the softening is invisible to a position norm (the clamped contact is self-consistent). ε = 1e-5 recovers k = 10⁵ (1.25) and then floors where fixed 1 ms does.</w:t>
       </w:r>
     </w:p>
     <w:p>
@@ -1965,7 +1965,7 @@
         <w:pStyle w:val="ListBullet"/>
       </w:pPr>
       <w:r>
-        <w:t>The 0.73 at k = 10³ on every MuJoCo line is the soft-clutter calibration offset: τ = 24 ms scaled from 2.4 ms is 1.37× too stiff because stiffness ∝ 1/τ² holds only through the impedance at one violation.</w:t>
+        <w:t>The k = 10³ anchor now reads 1.00 on every MuJoCo line: τ(k) is calibrated through two measured anchors (2.4 ms at 10⁵, 31.8 ms at 10³, τ ∝ k^−0.56) instead of the 1/√k scaling that had left a 1.37× offset.</w:t>
       </w:r>
     </w:p>
     <w:p>
@@ -2043,14 +2043,6 @@
         <w:pStyle w:val="ListBullet"/>
       </w:pPr>
       <w:r>
-        <w:t>Decide whether to state the soft-clutter 1.37× offset or rerun the soft set with τ = 28 ms (hours).</w:t>
-      </w:r>
-    </w:p>
-    <w:p>
-      <w:pPr>
-        <w:pStyle w:val="ListBullet"/>
-      </w:pPr>
-      <w:r>
         <w:t>One sentence in the paper on effective-mass scaling (the box in B12 sits 20× stiffer than the sphere with the same τ).</w:t>
       </w:r>
     </w:p>
@@ -2421,7 +2413,7 @@
         <w:pStyle w:val="ListBullet"/>
       </w:pPr>
       <w:r>
-        <w:t>Hard clutter, one scene, wall per simulated second: ICF EC 0.38 / 0.60 / 1.35 / 2.89 / 7.91 / 18.2 at ε = 1e-1 … 1e-6; MuJoCo EC 0.092 / 0.30 / 1.04 / 2.92 / 5.63 / 13.8 — MuJoCo cheaper at every ε (1.5–4×, equal at 1e-4). At 1024 scenes: ICF EC 15 / 23.8 / 49.3 / 115 / 343 / 856 vs MuJoCo EC 0.47 / 1.54 / 5.02 / 15.8 / 37.8 / 88.4 (5–30×).</w:t>
+        <w:t>Hard clutter, one scene, wall per simulated second: ICF EC 0.30 / 0.55 / 1.17 / 3.29 / 9.27 / 25.4 at ε = 1e-1 … 1e-6; MuJoCo EC 0.093 / 0.30 / 1.04 / 2.81 / 5.78 / 15.2 — MuJoCo cheaper at every ε (1.1–3.3×, near parity at 1e-3/1e-4). At 1024 scenes: ICF EC 11.5 / 21.9 / 45.8 / 129 / 422 / 1130 vs MuJoCo EC 0.51 / 1.61 / 5.25 / 15.6 / 37.2 / 91 (8–22×).</w:t>
       </w:r>
     </w:p>
     <w:p>
@@ -2453,7 +2445,7 @@
         <w:pStyle w:val="ListBullet"/>
       </w:pPr>
       <w:r>
-        <w:t>Table I analog, hard clutter: ICF EC artifact-free from ε = 1e-2 (real-time rate 166 %) — at 1e-1 it is not (7.0 mm max penetration); MuJoCo EC artifact-free from 1e-3 (96 %); fixed ICF only at 1 ms (88 %; 10/5/2 ms have 27.8/9.4/3.9 mm); fixed MuJoCo from 2 ms (296 %). Soft clutter: every cell artifact-free.</w:t>
+        <w:t>Table I analog, hard clutter: both EC arms artifact-free from ε = 1e-2 (real-time rate ICF 181 %, MuJoCo 335 %), both fixed arms from 2 ms (ICF 172 %, MuJoCo 294 %); at 10 ms the max penetration is 13.4 mm (MuJoCo) and 4.1 mm (ICF). Soft clutter: no ejections anywhere; MuJoCo's max rides the 22.7 mm impact-depth bound (the ε = 1e-2/1e-3 cells cross it by 1–4 % — the binary flag straddles there and carries no information).</w:t>
       </w:r>
     </w:p>
     <w:p>
@@ -2673,7 +2665,7 @@
         <w:pStyle w:val="ListBullet"/>
       </w:pPr>
       <w:r>
-        <w:t>Hard clutter, mean penetration (µm) at 10/5/2/1 ms: ICF fixed 226 / 34.6 / 8.4 / 6.4; MuJoCo fixed 336 / 100 / 17.0 / 6.6 — both converge to the model's 6.4 µm at 1 ms. Error control at ε = 1e-1 … 1e-4: ICF 30 / 7.1 / 6.2 / 6.1; MuJoCo 550 / 150 / 20.3 / 7.0.</w:t>
+        <w:t>Hard clutter, mean penetration (µm) at 10/5/2/1 ms: ICF fixed 18.4 / 17.0 / 9.3 / 9.0; MuJoCo fixed 385 / 116 / 21.6 / 7.7 — both converge toward the model's 6.4 µm. Error control at ε = 1e-1 … 1e-4: ICF 14.2 / 7.4 / 7.5 / 6.3; MuJoCo 504 / 131 / 19.3 / 7.5.</w:t>
       </w:r>
     </w:p>
     <w:p>
@@ -2681,7 +2673,7 @@
         <w:pStyle w:val="ListBullet"/>
       </w:pPr>
       <w:r>
-        <w:t>Max penetration (mm): ICF fixed 27.8 / 9.4 / 3.9 / 0.87; MuJoCo fixed 6.8 / 3.1 / 0.87 / 0.72; ICF EC 7.0 / 0.83 / 0.33 / 0.32; MuJoCo EC 10.1 / 3.9 / 1.1 / 0.71. Impact-depth criterion 2.27 mm.</w:t>
+        <w:t>Max penetration (mm): ICF fixed 4.1 / 5.7 / 2.1 / 1.6; MuJoCo fixed 13.4 / 2.8 / 1.5 / 0.7; ICF EC 3.1 / 1.1 / 0.8 / 0.6; MuJoCo EC 10.1 / 2.1 / 0.9 / 0.7. Impact-depth criterion 2.27 mm.</w:t>
       </w:r>
     </w:p>
     <w:p>
@@ -2689,7 +2681,7 @@
         <w:pStyle w:val="ListBullet"/>
       </w:pPr>
       <w:r>
-        <w:t>Ejections: fixed ICF at 10 ms ejects 1.6 % of bodies (passthrough: 2.8 cm per step &gt; 2.5 cm radius; the lagged spring launches a body first seen past its centre); every other cell 0 %.</w:t>
+        <w:t>Ejections: none, at any setting of any arm (the wall and dissipation faults of tables/hard_clutter_forensics.md are fixed; the earlier 1.6 % pass-through is gone).</w:t>
       </w:r>
     </w:p>
     <w:p>
@@ -2697,7 +2689,7 @@
         <w:pStyle w:val="ListBullet"/>
       </w:pPr>
       <w:r>
-        <w:t>Cheapest artifact-free, hard clutter (wall per simulated second, 64 scenes): MuJoCo fixed 2 ms 0.57 s; MuJoCo EC ε = 1e-3 1.9 s; ICF EC ε = 1e-2 2.3 s; ICF fixed 1 ms 4.1 s. Soft clutter: every setting of every arm artifact-free (mean 0.52–0.67 mm ≈ m g/k = 0.64 mm; max ≤ 6.5 mm ≪ 23 mm).</w:t>
+        <w:t>Cheapest artifact-free, hard clutter (wall per simulated second, 64 scenes): MuJoCo fixed 2 ms 0.57 s; MuJoCo EC ε = 1e-2 0.67 s; ICF EC ε = 1e-2 1.97 s; ICF fixed 2 ms 2.48 s — on ICF, error control is the cheaper artifact-free mode. Soft clutter: ICF mean at the model's 0.64 mm (0.65–0.68) everywhere, max ≤ 0.4× the bound; MuJoCo mean 1.5–1.7× the model and max riding the bound itself (no star drawn: the flag straddles).</w:t>
       </w:r>
     </w:p>
     <w:p>
@@ -2705,7 +2697,7 @@
         <w:pStyle w:val="ListBullet"/>
       </w:pPr>
       <w:r>
-        <w:t>Both models converge to the same resting compliance; coarse steps are soft in both for different reasons: MuJoCo's clamp (50× the resting depth at 10 ms), ICF's under-resolved impact (35×).</w:t>
+        <w:t>Both models converge to the same resting compliance; coarse steps are soft in both for different reasons: MuJoCo's clamp (60× the resting depth at 10 ms), ICF's under-resolved impact (2.9×).</w:t>
       </w:r>
     </w:p>
     <w:p>
@@ -2722,7 +2714,7 @@
         <w:pStyle w:val="ListBullet"/>
       </w:pPr>
       <w:r>
-        <w:t>On these pure clutter scenes MuJoCo fixed at 2 ms is the cheapest artifact-free arm — the figure does not argue for error control by itself.</w:t>
+        <w:t>On these pure clutter scenes MuJoCo fixed at 2 ms is the cheapest artifact-free arm overall — the figure argues for error control within ICF (ε = 1e-2 beats fixed 2 ms), not across solvers.</w:t>
       </w:r>
     </w:p>
     <w:p>
@@ -2731,14 +2723,6 @@
       </w:pPr>
       <w:r>
         <w:t>'Penetration' is ground penetration only (body–body overlaps are not read).</w:t>
-      </w:r>
-    </w:p>
-    <w:p>
-      <w:pPr>
-        <w:pStyle w:val="ListBullet"/>
-      </w:pPr>
-      <w:r>
-        <w:t>Soft clutter's MuJoCo arm is 1.37× stiffer than the model (B3), which slightly flatters its penetration.</w:t>
       </w:r>
     </w:p>
     <w:p>
@@ -3113,7 +3097,7 @@
         <w:pStyle w:val="ListBullet"/>
       </w:pPr>
       <w:r>
-        <w:t>ICF's step costs ~55× MuJoCo's per world at 2¹³ (fixed) and ~6× under error control. Not the Newton tolerance (B14: 1e-5…1e-8 changes wall &lt; 5 %): it is the convex Newton solve resolving stiff point contact to the model's compliance, and a batch pays for its slowest world.</w:t>
+        <w:t>ICF's step costs ~44× MuJoCo's per world at 2¹³ (fixed; 484 vs 11 µs per world per 100 ms boundary) and ~5× under error control (1354 vs 279 µs). Not the Newton tolerance (B14: 1e-5…1e-8 changes wall &lt; 5 %): it is the convex Newton solve resolving stiff point contact to the model's compliance, and a batch pays for its slowest world.</w:t>
       </w:r>
     </w:p>
     <w:p>
@@ -3309,7 +3293,7 @@
         <w:pStyle w:val="ListBullet"/>
       </w:pPr>
       <w:r>
-        <w:t>Floor (reference vs itself, mean dev): soft 11 µm ICF / 0.2 µm MuJoCo; hard 0.62 mm ICF / 0.28 mm MuJoCo. A point within a few × of it is noise.</w:t>
+        <w:t>Floor (reference vs itself, mean dev): soft 4.7 µm ICF / 0.4 µm MuJoCo; hard 1.8 mm ICF / 0.4 mm MuJoCo. A point within a few × of it is noise.</w:t>
       </w:r>
     </w:p>
     <w:p>
@@ -3317,7 +3301,7 @@
         <w:pStyle w:val="ListBullet"/>
       </w:pPr>
       <w:r>
-        <w:t>Soft clutter (not chaotic): fixed ICF 3.7 mm (10 ms) → 1.9 → 0.73 → 0.29 → 0.12 mm (0.5 ms); MuJoCo 2.4 → 1.1 → 0.35 → 0.15 → 0.08 — first order both. Requested ε bounds the measured deviation (ICF EC 0.39 mm at 1e-3, 41 µm at 1e-5). ICF error control gives ~2× less deviation than fixed ICF at the same cost across the range (ε = 1e-3: 0.39 mm at 0.45 s vs fixed 2 ms 0.73 mm at 0.58 s; 1e-4: 0.14 mm at 1.4 s vs fixed 1 ms 0.29 mm at 1.0 s; 1e-5: 41 µm at 3.2 s vs fixed 0.5 ms 0.12 mm at 1.9 s). MuJoCo error control lands on its own fixed line (1e-4: 96 µm at 0.54 s between fixed 1 ms 0.15 mm/0.42 s and 0.5 ms 0.08 mm/0.84 s) — a wash.</w:t>
+        <w:t>Soft clutter: fixed ICF 5.2 mm (10 ms) → 3.8 → 2.3 → 1.3 → 0.62 mm (0.5 ms); MuJoCo 1.7 → 0.85 → 0.35 → 0.19 → 0.086 — converging both. Requested ε tracks the measured deviation (ICF EC 1.8 mm at 1e-3, 0.15 mm at 1e-5). At matched cost ICF's two modes are close (ε = 1e-3: 1.8 mm at 0.89 s vs fixed 1 ms 1.3 mm at 1.06 s; 1e-4: 0.64 mm at 2.0 s vs fixed 0.5 ms 0.62 mm at 1.9 s), and MuJoCo EC lands on its own fixed line (1e-4: 79 µm at 0.37 s between fixed 1 ms 0.19 mm/0.41 s and 0.5 ms 0.086 mm/0.77 s) — on this bench error control matches, not beats, the fixed ladder; its saving is the settled phase (B7).</w:t>
       </w:r>
     </w:p>
     <w:p>
@@ -3325,7 +3309,7 @@
         <w:pStyle w:val="ListBullet"/>
       </w:pPr>
       <w:r>
-        <w:t>Hard clutter (chaotic): fixed ICF 20 → 15 → 11 → 4.6 → 2.7 mm; MuJoCo 8.3 → 5.8 → 3.3 → 2.3 → 1.2 mm — ~O(δt^0.7); MuJoCo 2–3× cheaper at the same δt. Requested ε ≠ measured (ICF EC ε = 1e-3 measures 5.6 mm). The tight end (ε ≤ 1e-4, δt ≤ 0.5 ms) sits within 2–4× of the floor and ranks nothing. In the middle neither controller beats its fixed line on this impact-dominated window (ICF EC 1e-3: 5.6 mm at 2.6 s ≈ fixed ICF between 1 and 2 ms; MuJoCo EC 1e-3: 2.5 mm at 1.4 s vs fixed 1 ms 2.3 mm at 0.9 s).</w:t>
+        <w:t>Hard clutter (chaotic): fixed ICF 21 → 13 → 10 → 9.2 → 5.6 mm; MuJoCo 8.4 → 5.4 → 3.0 → 2.6 → 1.4 mm; MuJoCo 2.5–3× cheaper at the same δt. Requested ε ≠ measured (ICF EC ε = 1e-3 measures 5.1 mm). The tight end (ε ≤ 1e-4, δt ≤ 0.5 ms) sits within 2–3× of the floor and ranks nothing. In the middle ICF EC 1e-3 (5.1 mm, 1.75 s) reaches fixed ICF's 0.5 ms deviation at 1.8× less cost — the one clear EC win — while MuJoCo EC 1e-3 (2.2 mm, 1.6 s) matches fixed 1 ms (2.6 mm, 0.9 s) at higher cost.</w:t>
       </w:r>
     </w:p>
     <w:p>
@@ -3477,7 +3461,7 @@
           <w:b w:val="0"/>
           <w:i w:val="0"/>
         </w:rPr>
-        <w:t>The consistency oracle failed on hard clutter (8 mm restart deviation for both backends) and on soft clutter for ICF (0.19 mm) while passing exactly on the ball — either the restart wiring was wrong or the solvers are not reproducible. SimBenchmark and Erez use determinism as a solver certificate; RL reproducibility (same seed = same run) depends on it.</w:t>
+        <w:t>The consistency bench's restart floor is nonzero on clutter (the ball restarts exactly) — either the restart wiring was wrong or the solvers are not reproducible. The determinism probe settled it: not reproducible (GPU reduction order). The self-check now asserts what a correct instrument must have — every window runs, the floor reproduces in magnitude across two runs, and it sits ≥ 10× below the coarsest knob's deviation — instead of an absolute threshold the solvers' own noise violates. SimBenchmark and Erez use determinism as a solver certificate; RL reproducibility (same seed = same run) depends on it.</w:t>
       </w:r>
     </w:p>
     <w:p>
@@ -9913,7 +9897,7 @@
           </w:tcPr>
           <w:p>
             <w:r>
-              <w:t>ejects 1.6 % (2.8 cm/step vs 2.5 cm radius); max pen 27.8 mm</w:t>
+              <w:t>no ejections on the corrected scene; max pen 4.1 mm = 1.8x the impact depth</w:t>
             </w:r>
           </w:p>
         </w:tc>
@@ -10681,7 +10665,7 @@
           </w:tcPr>
           <w:p>
             <w:r>
-              <w:t>τ=24 ms is 1.37× the model (ratio 0.73); documented, not rerun</w:t>
+              <w:t>τ=31.8 ms measured anchor; ratio 1.00 at k=10³ on every line</w:t>
             </w:r>
           </w:p>
         </w:tc>
@@ -12647,7 +12631,7 @@
           </w:tcPr>
           <w:p>
             <w:r>
-              <w:t>(24 ms, 1)</w:t>
+              <w:t>(31.8 ms, 1)</w:t>
             </w:r>
           </w:p>
         </w:tc>
@@ -12657,7 +12641,7 @@
           </w:tcPr>
           <w:p>
             <w:r>
-              <w:t>scaled 1/√k</w:t>
+              <w:t>measured anchor</w:t>
             </w:r>
           </w:p>
         </w:tc>
@@ -12667,7 +12651,7 @@
           </w:tcPr>
           <w:p>
             <w:r>
-              <w:t>1.37× too stiff (impedance) — documented</w:t>
+              <w:t>ratio 1.00 at k = 10³</w:t>
             </w:r>
           </w:p>
         </w:tc>
@@ -12837,7 +12821,7 @@
         <w:pStyle w:val="ListBullet"/>
       </w:pPr>
       <w:r>
-        <w:t>State the soft-clutter 1.37× offset, the mass scaling, and the training scenes' default solref, one sentence each.</w:t>
+        <w:t>State the effective-mass scaling and the training scenes' default solref, one sentence each (the soft-clutter offset is gone: measured anchor).</w:t>
       </w:r>
     </w:p>
     <w:p>
@@ -13711,7 +13695,7 @@
           </w:tcPr>
           <w:p>
             <w:r>
-              <w:t>336.3</w:t>
+              <w:t>385.3</w:t>
             </w:r>
           </w:p>
         </w:tc>
@@ -13721,7 +13705,7 @@
           </w:tcPr>
           <w:p>
             <w:r>
-              <w:t>6.79</w:t>
+              <w:t>13.40</w:t>
             </w:r>
           </w:p>
         </w:tc>
@@ -13731,7 +13715,7 @@
           </w:tcPr>
           <w:p>
             <w:r>
-              <w:t>527.3</w:t>
+              <w:t>962.8</w:t>
             </w:r>
           </w:p>
         </w:tc>
@@ -13793,7 +13777,7 @@
           </w:tcPr>
           <w:p>
             <w:r>
-              <w:t>100.2</w:t>
+              <w:t>115.9</w:t>
             </w:r>
           </w:p>
         </w:tc>
@@ -13813,7 +13797,7 @@
           </w:tcPr>
           <w:p>
             <w:r>
-              <w:t>154.8</w:t>
+              <w:t>231.3</w:t>
             </w:r>
           </w:p>
         </w:tc>
@@ -13833,7 +13817,7 @@
           </w:tcPr>
           <w:p>
             <w:r>
-              <w:t>0.21</w:t>
+              <w:t>0.22</w:t>
             </w:r>
           </w:p>
         </w:tc>
@@ -13875,7 +13859,7 @@
           </w:tcPr>
           <w:p>
             <w:r>
-              <w:t>16.9</w:t>
+              <w:t>21.6</w:t>
             </w:r>
           </w:p>
         </w:tc>
@@ -13885,7 +13869,7 @@
           </w:tcPr>
           <w:p>
             <w:r>
-              <w:t>0.82</w:t>
+              <w:t>1.53</w:t>
             </w:r>
           </w:p>
         </w:tc>
@@ -13895,7 +13879,7 @@
           </w:tcPr>
           <w:p>
             <w:r>
-              <w:t>39.7</w:t>
+              <w:t>43.0</w:t>
             </w:r>
           </w:p>
         </w:tc>
@@ -13957,7 +13941,7 @@
           </w:tcPr>
           <w:p>
             <w:r>
-              <w:t>6.5</w:t>
+              <w:t>7.7</w:t>
             </w:r>
           </w:p>
         </w:tc>
@@ -13967,7 +13951,7 @@
           </w:tcPr>
           <w:p>
             <w:r>
-              <w:t>0.75</w:t>
+              <w:t>0.72</w:t>
             </w:r>
           </w:p>
         </w:tc>
@@ -13977,7 +13961,7 @@
           </w:tcPr>
           <w:p>
             <w:r>
-              <w:t>8.0</w:t>
+              <w:t>9.5</w:t>
             </w:r>
           </w:p>
         </w:tc>
@@ -13997,7 +13981,7 @@
           </w:tcPr>
           <w:p>
             <w:r>
-              <w:t>1.13</w:t>
+              <w:t>1.20</w:t>
             </w:r>
           </w:p>
         </w:tc>
@@ -14039,7 +14023,7 @@
           </w:tcPr>
           <w:p>
             <w:r>
-              <w:t>546.2</w:t>
+              <w:t>503.6</w:t>
             </w:r>
           </w:p>
         </w:tc>
@@ -14049,7 +14033,7 @@
           </w:tcPr>
           <w:p>
             <w:r>
-              <w:t>10.05</w:t>
+              <w:t>10.06</w:t>
             </w:r>
           </w:p>
         </w:tc>
@@ -14059,7 +14043,7 @@
           </w:tcPr>
           <w:p>
             <w:r>
-              <w:t>1252.8</w:t>
+              <w:t>1229.2</w:t>
             </w:r>
           </w:p>
         </w:tc>
@@ -14079,7 +14063,7 @@
           </w:tcPr>
           <w:p>
             <w:r>
-              <w:t>0.22</w:t>
+              <w:t>0.23</w:t>
             </w:r>
           </w:p>
         </w:tc>
@@ -14121,7 +14105,7 @@
           </w:tcPr>
           <w:p>
             <w:r>
-              <w:t>143.3</w:t>
+              <w:t>131.0</w:t>
             </w:r>
           </w:p>
         </w:tc>
@@ -14131,7 +14115,7 @@
           </w:tcPr>
           <w:p>
             <w:r>
-              <w:t>1.84</w:t>
+              <w:t>2.13</w:t>
             </w:r>
           </w:p>
         </w:tc>
@@ -14141,7 +14125,7 @@
           </w:tcPr>
           <w:p>
             <w:r>
-              <w:t>400.8</w:t>
+              <w:t>405.6</w:t>
             </w:r>
           </w:p>
         </w:tc>
@@ -14161,7 +14145,7 @@
           </w:tcPr>
           <w:p>
             <w:r>
-              <w:t>0.61</w:t>
+              <w:t>0.67</w:t>
             </w:r>
           </w:p>
         </w:tc>
@@ -14203,7 +14187,7 @@
           </w:tcPr>
           <w:p>
             <w:r>
-              <w:t>20.3</w:t>
+              <w:t>19.3</w:t>
             </w:r>
           </w:p>
         </w:tc>
@@ -14213,7 +14197,7 @@
           </w:tcPr>
           <w:p>
             <w:r>
-              <w:t>1.10</w:t>
+              <w:t>0.89</w:t>
             </w:r>
           </w:p>
         </w:tc>
@@ -14223,7 +14207,7 @@
           </w:tcPr>
           <w:p>
             <w:r>
-              <w:t>53.2</w:t>
+              <w:t>52.9</w:t>
             </w:r>
           </w:p>
         </w:tc>
@@ -14243,7 +14227,7 @@
           </w:tcPr>
           <w:p>
             <w:r>
-              <w:t>1.81</w:t>
+              <w:t>2.10</w:t>
             </w:r>
           </w:p>
         </w:tc>
@@ -14285,7 +14269,7 @@
           </w:tcPr>
           <w:p>
             <w:r>
-              <w:t>6.8</w:t>
+              <w:t>7.5</w:t>
             </w:r>
           </w:p>
         </w:tc>
@@ -14305,7 +14289,7 @@
           </w:tcPr>
           <w:p>
             <w:r>
-              <w:t>10.2</w:t>
+              <w:t>10.3</w:t>
             </w:r>
           </w:p>
         </w:tc>
@@ -14325,7 +14309,7 @@
           </w:tcPr>
           <w:p>
             <w:r>
-              <w:t>7.28</w:t>
+              <w:t>7.38</w:t>
             </w:r>
           </w:p>
         </w:tc>
@@ -14367,7 +14351,7 @@
           </w:tcPr>
           <w:p>
             <w:r>
-              <w:t>16.9</w:t>
+              <w:t>18.4</w:t>
             </w:r>
           </w:p>
         </w:tc>
@@ -14377,7 +14361,7 @@
           </w:tcPr>
           <w:p>
             <w:r>
-              <w:t>4.51</w:t>
+              <w:t>4.10</w:t>
             </w:r>
           </w:p>
         </w:tc>
@@ -14387,7 +14371,7 @@
           </w:tcPr>
           <w:p>
             <w:r>
-              <w:t>48.7</w:t>
+              <w:t>61.8</w:t>
             </w:r>
           </w:p>
         </w:tc>
@@ -14407,7 +14391,7 @@
           </w:tcPr>
           <w:p>
             <w:r>
-              <w:t>0.73</w:t>
+              <w:t>0.84</w:t>
             </w:r>
           </w:p>
         </w:tc>
@@ -14449,7 +14433,7 @@
           </w:tcPr>
           <w:p>
             <w:r>
-              <w:t>12.6</w:t>
+              <w:t>17.0</w:t>
             </w:r>
           </w:p>
         </w:tc>
@@ -14459,7 +14443,7 @@
           </w:tcPr>
           <w:p>
             <w:r>
-              <w:t>5.14</w:t>
+              <w:t>5.68</w:t>
             </w:r>
           </w:p>
         </w:tc>
@@ -14469,7 +14453,7 @@
           </w:tcPr>
           <w:p>
             <w:r>
-              <w:t>25.7</w:t>
+              <w:t>38.3</w:t>
             </w:r>
           </w:p>
         </w:tc>
@@ -14489,7 +14473,7 @@
           </w:tcPr>
           <w:p>
             <w:r>
-              <w:t>1.29</w:t>
+              <w:t>1.45</w:t>
             </w:r>
           </w:p>
         </w:tc>
@@ -14531,7 +14515,7 @@
           </w:tcPr>
           <w:p>
             <w:r>
-              <w:t>6.7</w:t>
+              <w:t>9.3</w:t>
             </w:r>
           </w:p>
         </w:tc>
@@ -14541,7 +14525,7 @@
           </w:tcPr>
           <w:p>
             <w:r>
-              <w:t>0.91</w:t>
+              <w:t>2.11</w:t>
             </w:r>
           </w:p>
         </w:tc>
@@ -14551,7 +14535,7 @@
           </w:tcPr>
           <w:p>
             <w:r>
-              <w:t>14.9</w:t>
+              <w:t>16.1</w:t>
             </w:r>
           </w:p>
         </w:tc>
@@ -14571,7 +14555,7 @@
           </w:tcPr>
           <w:p>
             <w:r>
-              <w:t>2.37</w:t>
+              <w:t>2.48</w:t>
             </w:r>
           </w:p>
         </w:tc>
@@ -14613,7 +14597,7 @@
           </w:tcPr>
           <w:p>
             <w:r>
-              <w:t>6.1</w:t>
+              <w:t>9.0</w:t>
             </w:r>
           </w:p>
         </w:tc>
@@ -14623,7 +14607,7 @@
           </w:tcPr>
           <w:p>
             <w:r>
-              <w:t>1.14</w:t>
+              <w:t>1.58</w:t>
             </w:r>
           </w:p>
         </w:tc>
@@ -14633,7 +14617,7 @@
           </w:tcPr>
           <w:p>
             <w:r>
-              <w:t>12.9</w:t>
+              <w:t>13.9</w:t>
             </w:r>
           </w:p>
         </w:tc>
@@ -14653,7 +14637,7 @@
           </w:tcPr>
           <w:p>
             <w:r>
-              <w:t>4.48</w:t>
+              <w:t>4.50</w:t>
             </w:r>
           </w:p>
         </w:tc>
@@ -14695,7 +14679,7 @@
           </w:tcPr>
           <w:p>
             <w:r>
-              <w:t>12.5</w:t>
+              <w:t>14.2</w:t>
             </w:r>
           </w:p>
         </w:tc>
@@ -14705,7 +14689,7 @@
           </w:tcPr>
           <w:p>
             <w:r>
-              <w:t>2.57</w:t>
+              <w:t>3.13</w:t>
             </w:r>
           </w:p>
         </w:tc>
@@ -14715,7 +14699,7 @@
           </w:tcPr>
           <w:p>
             <w:r>
-              <w:t>34.4</w:t>
+              <w:t>44.9</w:t>
             </w:r>
           </w:p>
         </w:tc>
@@ -14735,7 +14719,7 @@
           </w:tcPr>
           <w:p>
             <w:r>
-              <w:t>1.23</w:t>
+              <w:t>1.36</w:t>
             </w:r>
           </w:p>
         </w:tc>
@@ -14777,7 +14761,7 @@
           </w:tcPr>
           <w:p>
             <w:r>
-              <w:t>6.9</w:t>
+              <w:t>7.4</w:t>
             </w:r>
           </w:p>
         </w:tc>
@@ -14787,7 +14771,7 @@
           </w:tcPr>
           <w:p>
             <w:r>
-              <w:t>0.95</w:t>
+              <w:t>1.07</w:t>
             </w:r>
           </w:p>
         </w:tc>
@@ -14797,7 +14781,7 @@
           </w:tcPr>
           <w:p>
             <w:r>
-              <w:t>15.5</w:t>
+              <w:t>16.1</w:t>
             </w:r>
           </w:p>
         </w:tc>
@@ -14817,7 +14801,7 @@
           </w:tcPr>
           <w:p>
             <w:r>
-              <w:t>2.47</w:t>
+              <w:t>1.97</w:t>
             </w:r>
           </w:p>
         </w:tc>
@@ -14859,7 +14843,7 @@
           </w:tcPr>
           <w:p>
             <w:r>
-              <w:t>5.7</w:t>
+              <w:t>7.5</w:t>
             </w:r>
           </w:p>
         </w:tc>
@@ -14869,7 +14853,7 @@
           </w:tcPr>
           <w:p>
             <w:r>
-              <w:t>0.48</w:t>
+              <w:t>0.83</w:t>
             </w:r>
           </w:p>
         </w:tc>
@@ -14879,7 +14863,7 @@
           </w:tcPr>
           <w:p>
             <w:r>
-              <w:t>11.7</w:t>
+              <w:t>12.0</w:t>
             </w:r>
           </w:p>
         </w:tc>
@@ -14899,7 +14883,7 @@
           </w:tcPr>
           <w:p>
             <w:r>
-              <w:t>2.94</w:t>
+              <w:t>3.99</w:t>
             </w:r>
           </w:p>
         </w:tc>
@@ -14941,7 +14925,7 @@
           </w:tcPr>
           <w:p>
             <w:r>
-              <w:t>5.7</w:t>
+              <w:t>6.3</w:t>
             </w:r>
           </w:p>
         </w:tc>
@@ -14951,7 +14935,7 @@
           </w:tcPr>
           <w:p>
             <w:r>
-              <w:t>0.64</w:t>
+              <w:t>0.63</w:t>
             </w:r>
           </w:p>
         </w:tc>
@@ -14961,7 +14945,7 @@
           </w:tcPr>
           <w:p>
             <w:r>
-              <w:t>10.1</w:t>
+              <w:t>10.2</w:t>
             </w:r>
           </w:p>
         </w:tc>
@@ -14981,7 +14965,7 @@
           </w:tcPr>
           <w:p>
             <w:r>
-              <w:t>8.10</w:t>
+              <w:t>9.67</w:t>
             </w:r>
           </w:p>
         </w:tc>
@@ -15004,7 +14988,7 @@
           <w:b w:val="0"/>
           <w:i w:val="0"/>
         </w:rPr>
-        <w:t>Cheapest artifact-free: mujoco 2 ms (0.57 s); mujoco-adaptive ε=0.01 (0.61 s); icf 2 ms (2.37 s); icf-adaptive ε=0.01 (2.47 s)</w:t>
+        <w:t>Cheapest artifact-free: mujoco 2 ms (0.57 s); mujoco-adaptive ε=0.01 (0.67 s); icf 2 ms (2.48 s); icf-adaptive ε=0.01 (1.97 s)</w:t>
       </w:r>
     </w:p>
     <w:p>
@@ -15020,7 +15004,7 @@
         <w:pStyle w:val="ListBullet"/>
       </w:pPr>
       <w:r>
-        <w:t>mujoco: 1 ms 0.673, 2 ms 0.33, 5 ms 0.124, 10 ms 0.0654</w:t>
+        <w:t>mujoco: 1 ms 0.628, 2 ms 0.34, 5 ms 0.124, 10 ms 0.0647</w:t>
       </w:r>
     </w:p>
     <w:p>
@@ -15028,7 +15012,7 @@
         <w:pStyle w:val="ListBullet"/>
       </w:pPr>
       <w:r>
-        <w:t>mujoco-adaptive: ε=1e-06 16.2, ε=1e-05 5.03, ε=0.0001 2.81, ε=0.001 1.01, ε=0.01 0.316, ε=0.1 0.0904</w:t>
+        <w:t>mujoco-adaptive: ε=1e-06 15.2, ε=1e-05 5.78, ε=0.0001 2.81, ε=0.001 1.04, ε=0.01 0.299, ε=0.1 0.0926</w:t>
       </w:r>
     </w:p>
     <w:p>
@@ -15036,7 +15020,7 @@
         <w:pStyle w:val="ListBullet"/>
       </w:pPr>
       <w:r>
-        <w:t>icf: 1 ms 1.07, 2 ms 0.625, 5 ms 0.292, 10 ms 0.16</w:t>
+        <w:t>icf: 1 ms 1.07, 2 ms 0.582, 5 ms 0.289, 10 ms 0.185</w:t>
       </w:r>
     </w:p>
     <w:p>
@@ -15044,7 +15028,7 @@
         <w:pStyle w:val="ListBullet"/>
       </w:pPr>
       <w:r>
-        <w:t>icf-adaptive: ε=1e-06 25 [budget-exhausted], ε=1e-05 9.15, ε=0.0001 3.33, ε=0.001 1.08, ε=0.01 0.571, ε=0.1 0.295</w:t>
+        <w:t>icf-adaptive: ε=1e-06 25.4, ε=1e-05 9.27, ε=0.0001 3.29, ε=0.001 1.17, ε=0.01 0.553, ε=0.1 0.304</w:t>
       </w:r>
     </w:p>
     <w:p>
@@ -15060,7 +15044,7 @@
         <w:pStyle w:val="ListBullet"/>
       </w:pPr>
       <w:r>
-        <w:t>mujoco: 1 ms 2.11, 2 ms 1.04, 5 ms 0.389, 10 ms 0.183</w:t>
+        <w:t>mujoco: 1 ms 2.11, 2 ms 1.04, 5 ms 0.387, 10 ms 0.183</w:t>
       </w:r>
     </w:p>
     <w:p>
@@ -15068,7 +15052,7 @@
         <w:pStyle w:val="ListBullet"/>
       </w:pPr>
       <w:r>
-        <w:t>mujoco-adaptive: ε=1e-06 88.4, ε=1e-05 37.8, ε=0.0001 15.8, ε=0.001 5.02, ε=0.01 1.54, ε=0.1 0.47</w:t>
+        <w:t>mujoco-adaptive: ε=1e-06 91, ε=1e-05 37.2, ε=0.0001 15.6, ε=0.001 5.25, ε=0.01 1.61, ε=0.1 0.513</w:t>
       </w:r>
     </w:p>
     <w:p>
@@ -15076,7 +15060,7 @@
         <w:pStyle w:val="ListBullet"/>
       </w:pPr>
       <w:r>
-        <w:t>icf: 1 ms 38.2, 2 ms 20.9, 5 ms 10.9, 10 ms 7.47</w:t>
+        <w:t>icf: 1 ms 38.3, 2 ms 21.3, 5 ms 10.4, 10 ms 6.31</w:t>
       </w:r>
     </w:p>
     <w:p>
@@ -15084,7 +15068,7 @@
         <w:pStyle w:val="ListBullet"/>
       </w:pPr>
       <w:r>
-        <w:t>icf-adaptive: ε=1e-06 856, ε=1e-05 343, ε=0.0001 115, ε=0.001 49.3, ε=0.01 23.8, ε=0.1 15</w:t>
+        <w:t>icf-adaptive: ε=1e-06 1.13e+03, ε=1e-05 422, ε=0.0001 129, ε=0.001 45.8, ε=0.01 21.9, ε=0.1 11.5</w:t>
       </w:r>
     </w:p>
     <w:p>
@@ -15100,7 +15084,7 @@
         <w:pStyle w:val="ListBullet"/>
       </w:pPr>
       <w:r>
-        <w:t>mujoco: 10 ms 8.31 @ 0.10, 5 ms 5.76 @ 0.19, 2 ms 3.28 @ 0.45, 1 ms 2.27 @ 0.89, 500 µs 1.2 @ 1.75, 100 µs 0.281 @ 7.84</w:t>
+        <w:t>mujoco: 10 ms 8.38 @ 0.10, 5 ms 5.38 @ 0.19, 2 ms 3.03 @ 0.44, 1 ms 2.64 @ 0.89, 500 µs 1.37 @ 1.75, 100 µs 0.398 @ 7.64</w:t>
       </w:r>
     </w:p>
     <w:p>
@@ -15108,7 +15092,7 @@
         <w:pStyle w:val="ListBullet"/>
       </w:pPr>
       <w:r>
-        <w:t>mujoco-adaptive: ε=0.1 6.21 @ 0.30, ε=0.01 4.54 @ 0.49, ε=0.001 2.45 @ 1.44, ε=0.0001 0.885 @ 3.46, ε=1e-05 0.924 @ 6.33</w:t>
+        <w:t>mujoco-adaptive: ε=0.1 5.34 @ 0.30, ε=0.01 5.99 @ 0.56, ε=0.001 2.16 @ 1.59, ε=0.0001 1.13 @ 3.29, ε=1e-05 1.02 @ 6.88</w:t>
       </w:r>
     </w:p>
     <w:p>
@@ -15116,7 +15100,7 @@
         <w:pStyle w:val="ListBullet"/>
       </w:pPr>
       <w:r>
-        <w:t>icf: 10 ms 20.4 @ 0.27, 5 ms 15.4 @ 0.47, 2 ms 11.3 @ 1.01, 1 ms 4.6 @ 1.90, 500 µs 2.71 @ 3.49, 100 µs 0.615 @ 12.37</w:t>
+        <w:t>icf: 10 ms 21.2 @ 0.25, 5 ms 12.6 @ 0.52, 2 ms 10.2 @ 1.01, 1 ms 9.2 @ 2.42, 500 µs 5.56 @ 3.14, 100 µs 1.79 @ 14.10</w:t>
       </w:r>
     </w:p>
     <w:p>
@@ -15124,7 +15108,7 @@
         <w:pStyle w:val="ListBullet"/>
       </w:pPr>
       <w:r>
-        <w:t>icf-adaptive: ε=0.1 13.1 @ 0.81, ε=0.01 10 @ 1.07, ε=0.001 5.62 @ 2.64, ε=0.0001 1.65 @ 4.26, ε=1e-05 1.14 @ 9.06</w:t>
+        <w:t>icf-adaptive: ε=0.1 12.5 @ 0.93, ε=0.01 11.9 @ 0.91, ε=0.001 5.06 @ 1.75, ε=0.0001 4.39 @ 5.78, ε=1e-05 3.72 @ 13.47</w:t>
       </w:r>
     </w:p>
     <w:p>
@@ -15140,7 +15124,7 @@
         <w:pStyle w:val="ListBullet"/>
       </w:pPr>
       <w:r>
-        <w:t>mujoco: 64: 10.1, 128: 10.7, 256: 12, 512: 14.4, 1024: 18.6, 2048: 30.2, 4096: 50.4, 8192: 90.7 → per world at 8192: 11 µs</w:t>
+        <w:t>mujoco: 64: 10.3, 128: 10.7, 256: 12.1, 512: 14.4, 1024: 18.4, 2048: 30.3, 4096: 50.5, 8192: 90.8 → per world at 8192: 11 µs</w:t>
       </w:r>
     </w:p>
     <w:p>
@@ -15148,7 +15132,7 @@
         <w:pStyle w:val="ListBullet"/>
       </w:pPr>
       <w:r>
-        <w:t>mujoco-adaptive: 64: 174, 128: 224, 256: 263, 512: 316, 1024: 415, 2048: 719, 4096: 1.22e+03, 8192: 2.19e+03 → per world at 8192: 268 µs</w:t>
+        <w:t>mujoco-adaptive: 64: 159, 128: 209, 256: 255, 512: 305, 1024: 432, 2048: 705, 4096: 1.17e+03, 8192: 2.29e+03 → per world at 8192: 279 µs</w:t>
       </w:r>
     </w:p>
     <w:p>
@@ -15156,7 +15140,7 @@
         <w:pStyle w:val="ListBullet"/>
       </w:pPr>
       <w:r>
-        <w:t>icf: 64: 101, 128: 142, 256: 211, 512: 338, 1024: 613, 2048: 1.26e+03, 4096: 2.54e+03, 8192: 5.06e+03 → per world at 8192: 618 µs</w:t>
+        <w:t>icf: 64: 75.9, 128: 112, 256: 170, 512: 275, 1024: 513, 2048: 1.01e+03, 4096: 2.01e+03, 8192: 3.96e+03 → per world at 8192: 484 µs</w:t>
       </w:r>
     </w:p>
     <w:p>
@@ -15164,7 +15148,7 @@
         <w:pStyle w:val="ListBullet"/>
       </w:pPr>
       <w:r>
-        <w:t>icf-adaptive: 64: 322, 128: 474, 256: 651, 512: 1.03e+03, 1024: 1.79e+03, 2048: 3.28e+03, 4096: 6.32e+03, 8192: 1.27e+04 → per world at 8192: 1549 µs</w:t>
+        <w:t>icf-adaptive: 64: 344, 128: 413, 256: 595, 512: 878, 1024: 1.55e+03, 2048: 2.93e+03, 4096: 5.64e+03, 8192: 1.11e+04 → per world at 8192: 1354 µs</w:t>
       </w:r>
     </w:p>
     <w:p>
@@ -15324,7 +15308,7 @@
           </w:tcPr>
           <w:p>
             <w:r>
-              <w:t>516.5</w:t>
+              <w:t>963.4</w:t>
             </w:r>
           </w:p>
         </w:tc>
@@ -15334,7 +15318,7 @@
           </w:tcPr>
           <w:p>
             <w:r>
-              <w:t>3.84</w:t>
+              <w:t>21.95</w:t>
             </w:r>
           </w:p>
         </w:tc>
@@ -15344,7 +15328,7 @@
           </w:tcPr>
           <w:p>
             <w:r>
-              <w:t>619.7</w:t>
+              <w:t>3087.4</w:t>
             </w:r>
           </w:p>
         </w:tc>
@@ -15406,7 +15390,7 @@
           </w:tcPr>
           <w:p>
             <w:r>
-              <w:t>550.4</w:t>
+              <w:t>1012.7</w:t>
             </w:r>
           </w:p>
         </w:tc>
@@ -15416,7 +15400,7 @@
           </w:tcPr>
           <w:p>
             <w:r>
-              <w:t>4.45</w:t>
+              <w:t>15.76</w:t>
             </w:r>
           </w:p>
         </w:tc>
@@ -15426,7 +15410,7 @@
           </w:tcPr>
           <w:p>
             <w:r>
-              <w:t>856.8</w:t>
+              <w:t>3489.2</w:t>
             </w:r>
           </w:p>
         </w:tc>
@@ -15446,7 +15430,7 @@
           </w:tcPr>
           <w:p>
             <w:r>
-              <w:t>0.09</w:t>
+              <w:t>0.12</w:t>
             </w:r>
           </w:p>
         </w:tc>
@@ -15488,7 +15472,7 @@
           </w:tcPr>
           <w:p>
             <w:r>
-              <w:t>561.2</w:t>
+              <w:t>1068.4</w:t>
             </w:r>
           </w:p>
         </w:tc>
@@ -15498,7 +15482,7 @@
           </w:tcPr>
           <w:p>
             <w:r>
-              <w:t>5.78</w:t>
+              <w:t>19.18</w:t>
             </w:r>
           </w:p>
         </w:tc>
@@ -15508,7 +15492,7 @@
           </w:tcPr>
           <w:p>
             <w:r>
-              <w:t>942.6</w:t>
+              <w:t>3638.4</w:t>
             </w:r>
           </w:p>
         </w:tc>
@@ -15528,7 +15512,7 @@
           </w:tcPr>
           <w:p>
             <w:r>
-              <w:t>0.21</w:t>
+              <w:t>0.25</w:t>
             </w:r>
           </w:p>
         </w:tc>
@@ -15570,7 +15554,7 @@
           </w:tcPr>
           <w:p>
             <w:r>
-              <w:t>562.7</w:t>
+              <w:t>1089.7</w:t>
             </w:r>
           </w:p>
         </w:tc>
@@ -15580,7 +15564,7 @@
           </w:tcPr>
           <w:p>
             <w:r>
-              <w:t>6.51</w:t>
+              <w:t>18.07</w:t>
             </w:r>
           </w:p>
         </w:tc>
@@ -15590,7 +15574,7 @@
           </w:tcPr>
           <w:p>
             <w:r>
-              <w:t>1003.1</w:t>
+              <w:t>3665.9</w:t>
             </w:r>
           </w:p>
         </w:tc>
@@ -15652,7 +15636,7 @@
           </w:tcPr>
           <w:p>
             <w:r>
-              <w:t>3094.8</w:t>
+              <w:t>3560.4</w:t>
             </w:r>
           </w:p>
         </w:tc>
@@ -15662,7 +15646,7 @@
           </w:tcPr>
           <w:p>
             <w:r>
-              <w:t>4.92</w:t>
+              <w:t>22.33</w:t>
             </w:r>
           </w:p>
         </w:tc>
@@ -15672,7 +15656,7 @@
           </w:tcPr>
           <w:p>
             <w:r>
-              <w:t>4895.3</w:t>
+              <w:t>4904.3</w:t>
             </w:r>
           </w:p>
         </w:tc>
@@ -15734,7 +15718,7 @@
           </w:tcPr>
           <w:p>
             <w:r>
-              <w:t>1015.4</w:t>
+              <w:t>1442.2</w:t>
             </w:r>
           </w:p>
         </w:tc>
@@ -15744,7 +15728,7 @@
           </w:tcPr>
           <w:p>
             <w:r>
-              <w:t>5.71</w:t>
+              <w:t>22.89</w:t>
             </w:r>
           </w:p>
         </w:tc>
@@ -15754,7 +15738,7 @@
           </w:tcPr>
           <w:p>
             <w:r>
-              <w:t>2796.4</w:t>
+              <w:t>3938.8</w:t>
             </w:r>
           </w:p>
         </w:tc>
@@ -15774,7 +15758,7 @@
           </w:tcPr>
           <w:p>
             <w:r>
-              <w:t>0.14</w:t>
+              <w:t>0.09</w:t>
             </w:r>
           </w:p>
         </w:tc>
@@ -15784,7 +15768,7 @@
           </w:tcPr>
           <w:p>
             <w:r>
-              <w:t>yes</w:t>
+              <w:t>no</w:t>
             </w:r>
           </w:p>
         </w:tc>
@@ -15816,7 +15800,7 @@
           </w:tcPr>
           <w:p>
             <w:r>
-              <w:t>619.9</w:t>
+              <w:t>1139.2</w:t>
             </w:r>
           </w:p>
         </w:tc>
@@ -15826,7 +15810,7 @@
           </w:tcPr>
           <w:p>
             <w:r>
-              <w:t>6.17</w:t>
+              <w:t>23.66</w:t>
             </w:r>
           </w:p>
         </w:tc>
@@ -15836,7 +15820,7 @@
           </w:tcPr>
           <w:p>
             <w:r>
-              <w:t>915.8</w:t>
+              <w:t>3359.4</w:t>
             </w:r>
           </w:p>
         </w:tc>
@@ -15856,7 +15840,7 @@
           </w:tcPr>
           <w:p>
             <w:r>
-              <w:t>0.28</w:t>
+              <w:t>0.26</w:t>
             </w:r>
           </w:p>
         </w:tc>
@@ -15866,7 +15850,7 @@
           </w:tcPr>
           <w:p>
             <w:r>
-              <w:t>yes</w:t>
+              <w:t>no</w:t>
             </w:r>
           </w:p>
         </w:tc>
@@ -15898,7 +15882,7 @@
           </w:tcPr>
           <w:p>
             <w:r>
-              <w:t>577.6</w:t>
+              <w:t>1093.9</w:t>
             </w:r>
           </w:p>
         </w:tc>
@@ -15908,7 +15892,7 @@
           </w:tcPr>
           <w:p>
             <w:r>
-              <w:t>6.39</w:t>
+              <w:t>19.96</w:t>
             </w:r>
           </w:p>
         </w:tc>
@@ -15918,7 +15902,7 @@
           </w:tcPr>
           <w:p>
             <w:r>
-              <w:t>1062.6</w:t>
+              <w:t>3536.8</w:t>
             </w:r>
           </w:p>
         </w:tc>
@@ -15938,7 +15922,7 @@
           </w:tcPr>
           <w:p>
             <w:r>
-              <w:t>0.97</w:t>
+              <w:t>0.66</w:t>
             </w:r>
           </w:p>
         </w:tc>
@@ -15980,7 +15964,7 @@
           </w:tcPr>
           <w:p>
             <w:r>
-              <w:t>669.8</w:t>
+              <w:t>683.4</w:t>
             </w:r>
           </w:p>
         </w:tc>
@@ -15990,7 +15974,7 @@
           </w:tcPr>
           <w:p>
             <w:r>
-              <w:t>5.37</w:t>
+              <w:t>5.32</w:t>
             </w:r>
           </w:p>
         </w:tc>
@@ -16000,7 +15984,7 @@
           </w:tcPr>
           <w:p>
             <w:r>
-              <w:t>1032.6</w:t>
+              <w:t>1475.9</w:t>
             </w:r>
           </w:p>
         </w:tc>
@@ -16020,7 +16004,7 @@
           </w:tcPr>
           <w:p>
             <w:r>
-              <w:t>0.33</w:t>
+              <w:t>0.39</w:t>
             </w:r>
           </w:p>
         </w:tc>
@@ -16062,7 +16046,7 @@
           </w:tcPr>
           <w:p>
             <w:r>
-              <w:t>667.4</w:t>
+              <w:t>680.4</w:t>
             </w:r>
           </w:p>
         </w:tc>
@@ -16072,7 +16056,7 @@
           </w:tcPr>
           <w:p>
             <w:r>
-              <w:t>5.94</w:t>
+              <w:t>6.88</w:t>
             </w:r>
           </w:p>
         </w:tc>
@@ -16082,7 +16066,7 @@
           </w:tcPr>
           <w:p>
             <w:r>
-              <w:t>994.2</w:t>
+              <w:t>1367.0</w:t>
             </w:r>
           </w:p>
         </w:tc>
@@ -16102,7 +16086,7 @@
           </w:tcPr>
           <w:p>
             <w:r>
-              <w:t>0.65</w:t>
+              <w:t>0.76</w:t>
             </w:r>
           </w:p>
         </w:tc>
@@ -16144,7 +16128,7 @@
           </w:tcPr>
           <w:p>
             <w:r>
-              <w:t>677.0</w:t>
+              <w:t>680.2</w:t>
             </w:r>
           </w:p>
         </w:tc>
@@ -16154,7 +16138,7 @@
           </w:tcPr>
           <w:p>
             <w:r>
-              <w:t>7.14</w:t>
+              <w:t>8.32</w:t>
             </w:r>
           </w:p>
         </w:tc>
@@ -16164,7 +16148,7 @@
           </w:tcPr>
           <w:p>
             <w:r>
-              <w:t>1097.2</w:t>
+              <w:t>1301.5</w:t>
             </w:r>
           </w:p>
         </w:tc>
@@ -16184,7 +16168,7 @@
           </w:tcPr>
           <w:p>
             <w:r>
-              <w:t>1.23</w:t>
+              <w:t>1.39</w:t>
             </w:r>
           </w:p>
         </w:tc>
@@ -16226,7 +16210,7 @@
           </w:tcPr>
           <w:p>
             <w:r>
-              <w:t>674.2</w:t>
+              <w:t>683.9</w:t>
             </w:r>
           </w:p>
         </w:tc>
@@ -16236,7 +16220,7 @@
           </w:tcPr>
           <w:p>
             <w:r>
-              <w:t>7.38</w:t>
+              <w:t>9.29</w:t>
             </w:r>
           </w:p>
         </w:tc>
@@ -16246,7 +16230,7 @@
           </w:tcPr>
           <w:p>
             <w:r>
-              <w:t>1235.7</w:t>
+              <w:t>1404.9</w:t>
             </w:r>
           </w:p>
         </w:tc>
@@ -16266,7 +16250,7 @@
           </w:tcPr>
           <w:p>
             <w:r>
-              <w:t>2.35</w:t>
+              <w:t>2.54</w:t>
             </w:r>
           </w:p>
         </w:tc>
@@ -16308,7 +16292,7 @@
           </w:tcPr>
           <w:p>
             <w:r>
-              <w:t>643.6</w:t>
+              <w:t>650.0</w:t>
             </w:r>
           </w:p>
         </w:tc>
@@ -16318,7 +16302,7 @@
           </w:tcPr>
           <w:p>
             <w:r>
-              <w:t>3.27</w:t>
+              <w:t>4.55</w:t>
             </w:r>
           </w:p>
         </w:tc>
@@ -16328,7 +16312,7 @@
           </w:tcPr>
           <w:p>
             <w:r>
-              <w:t>908.2</w:t>
+              <w:t>1005.8</w:t>
             </w:r>
           </w:p>
         </w:tc>
@@ -16348,7 +16332,7 @@
           </w:tcPr>
           <w:p>
             <w:r>
-              <w:t>0.26</w:t>
+              <w:t>0.31</w:t>
             </w:r>
           </w:p>
         </w:tc>
@@ -16390,7 +16374,7 @@
           </w:tcPr>
           <w:p>
             <w:r>
-              <w:t>631.8</w:t>
+              <w:t>653.9</w:t>
             </w:r>
           </w:p>
         </w:tc>
@@ -16400,7 +16384,7 @@
           </w:tcPr>
           <w:p>
             <w:r>
-              <w:t>3.94</w:t>
+              <w:t>7.23</w:t>
             </w:r>
           </w:p>
         </w:tc>
@@ -16410,7 +16394,7 @@
           </w:tcPr>
           <w:p>
             <w:r>
-              <w:t>933.7</w:t>
+              <w:t>1058.7</w:t>
             </w:r>
           </w:p>
         </w:tc>
@@ -16430,7 +16414,7 @@
           </w:tcPr>
           <w:p>
             <w:r>
-              <w:t>0.52</w:t>
+              <w:t>0.79</w:t>
             </w:r>
           </w:p>
         </w:tc>
@@ -16472,7 +16456,7 @@
           </w:tcPr>
           <w:p>
             <w:r>
-              <w:t>653.9</w:t>
+              <w:t>662.8</w:t>
             </w:r>
           </w:p>
         </w:tc>
@@ -16482,7 +16466,7 @@
           </w:tcPr>
           <w:p>
             <w:r>
-              <w:t>5.78</w:t>
+              <w:t>7.24</w:t>
             </w:r>
           </w:p>
         </w:tc>
@@ -16492,7 +16476,7 @@
           </w:tcPr>
           <w:p>
             <w:r>
-              <w:t>981.4</w:t>
+              <w:t>1182.7</w:t>
             </w:r>
           </w:p>
         </w:tc>
@@ -16512,7 +16496,7 @@
           </w:tcPr>
           <w:p>
             <w:r>
-              <w:t>1.28</w:t>
+              <w:t>1.59</w:t>
             </w:r>
           </w:p>
         </w:tc>
@@ -16554,7 +16538,7 @@
           </w:tcPr>
           <w:p>
             <w:r>
-              <w:t>658.3</w:t>
+              <w:t>670.3</w:t>
             </w:r>
           </w:p>
         </w:tc>
@@ -16564,7 +16548,7 @@
           </w:tcPr>
           <w:p>
             <w:r>
-              <w:t>7.11</w:t>
+              <w:t>8.75</w:t>
             </w:r>
           </w:p>
         </w:tc>
@@ -16574,7 +16558,7 @@
           </w:tcPr>
           <w:p>
             <w:r>
-              <w:t>1228.7</w:t>
+              <w:t>1484.7</w:t>
             </w:r>
           </w:p>
         </w:tc>
@@ -16594,7 +16578,7 @@
           </w:tcPr>
           <w:p>
             <w:r>
-              <w:t>3.81</w:t>
+              <w:t>4.38</w:t>
             </w:r>
           </w:p>
         </w:tc>
@@ -16617,7 +16601,7 @@
           <w:b w:val="0"/>
           <w:i w:val="0"/>
         </w:rPr>
-        <w:t>Cheapest artifact-free: mujoco 10 ms (0.05 s); mujoco-adaptive ε=0.1 (0.02 s); icf 10 ms (0.33 s); icf-adaptive ε=0.1 (0.26 s)</w:t>
+        <w:t>Cheapest artifact-free: mujoco 10 ms (0.05 s); mujoco-adaptive ε=0.1 (0.02 s); icf 10 ms (0.39 s); icf-adaptive ε=0.1 (0.31 s)</w:t>
       </w:r>
     </w:p>
     <w:p>
@@ -16633,7 +16617,7 @@
         <w:pStyle w:val="ListBullet"/>
       </w:pPr>
       <w:r>
-        <w:t>mujoco: 1 ms 0.403, 2 ms 0.203, 5 ms 0.0834, 10 ms 0.0413</w:t>
+        <w:t>mujoco: 1 ms 0.409, 2 ms 0.214, 5 ms 0.0958, 10 ms 0.0435</w:t>
       </w:r>
     </w:p>
     <w:p>
@@ -16641,7 +16625,7 @@
         <w:pStyle w:val="ListBullet"/>
       </w:pPr>
       <w:r>
-        <w:t>mujoco-adaptive: ε=1e-06 3.98, ε=1e-05 1.76, ε=0.0001 0.804, ε=0.001 0.304, ε=0.01 0.131, ε=0.1 0.0405</w:t>
+        <w:t>mujoco-adaptive: ε=1e-06 3.41, ε=1e-05 1.46, ε=0.0001 0.635, ε=0.001 0.25, ε=0.01 0.12, ε=0.1 0.0447</w:t>
       </w:r>
     </w:p>
     <w:p>
@@ -16649,7 +16633,7 @@
         <w:pStyle w:val="ListBullet"/>
       </w:pPr>
       <w:r>
-        <w:t>icf: 1 ms 0.818, 2 ms 0.429, 5 ms 0.199, 10 ms 0.113</w:t>
+        <w:t>icf: 1 ms 0.822, 2 ms 0.426, 5 ms 0.207, 10 ms 0.112</w:t>
       </w:r>
     </w:p>
     <w:p>
@@ -16657,7 +16641,7 @@
         <w:pStyle w:val="ListBullet"/>
       </w:pPr>
       <w:r>
-        <w:t>icf-adaptive: ε=1e-06 14.3, ε=1e-05 5.04, ε=0.0001 1.59, ε=0.001 0.55, ε=0.01 0.215, ε=0.1 0.125</w:t>
+        <w:t>icf-adaptive: ε=1e-06 14.3, ε=1e-05 5.17, ε=0.0001 1.47, ε=0.001 0.571, ε=0.01 0.205, ε=0.1 0.131</w:t>
       </w:r>
     </w:p>
     <w:p>
@@ -16673,7 +16657,7 @@
         <w:pStyle w:val="ListBullet"/>
       </w:pPr>
       <w:r>
-        <w:t>mujoco: 1 ms 0.844, 2 ms 0.417, 5 ms 0.169, 10 ms 0.0835</w:t>
+        <w:t>mujoco: 1 ms 0.838, 2 ms 0.435, 5 ms 0.19, 10 ms 0.0875</w:t>
       </w:r>
     </w:p>
     <w:p>
@@ -16681,7 +16665,7 @@
         <w:pStyle w:val="ListBullet"/>
       </w:pPr>
       <w:r>
-        <w:t>mujoco-adaptive: ε=1e-06 11.5, ε=1e-05 5.31, ε=0.0001 2.4, ε=0.001 0.667, ε=0.01 0.277, ε=0.1 0.0767</w:t>
+        <w:t>mujoco-adaptive: ε=1e-06 9.91, ε=1e-05 4.41, ε=0.0001 1.68, ε=0.001 0.592, ε=0.01 0.239, ε=0.1 0.0817</w:t>
       </w:r>
     </w:p>
     <w:p>
@@ -16689,7 +16673,7 @@
         <w:pStyle w:val="ListBullet"/>
       </w:pPr>
       <w:r>
-        <w:t>icf: 1 ms 25.1, 2 ms 14.3, 5 ms 6.66, 10 ms 3.91</w:t>
+        <w:t>icf: 1 ms 29, 2 ms 14.7, 5 ms 7.36, 10 ms 3.99</w:t>
       </w:r>
     </w:p>
     <w:p>
@@ -16697,7 +16681,7 @@
         <w:pStyle w:val="ListBullet"/>
       </w:pPr>
       <w:r>
-        <w:t>icf-adaptive: ε=1e-06 458, ε=1e-05 162, ε=0.0001 39.5, ε=0.001 16.9, ε=0.01 7.78, ε=0.1 3.83</w:t>
+        <w:t>icf-adaptive: ε=1e-06 608, ε=1e-05 214, ε=0.0001 53, ε=0.001 19.8, ε=0.01 8.25, ε=0.1 4.59</w:t>
       </w:r>
     </w:p>
     <w:p>
@@ -16713,7 +16697,7 @@
         <w:pStyle w:val="ListBullet"/>
       </w:pPr>
       <w:r>
-        <w:t>mujoco: 10 ms 2.36 @ 0.05, 5 ms 1.07 @ 0.09, 2 ms 0.348 @ 0.23, 1 ms 0.15 @ 0.42, 500 µs 0.0769 @ 0.84, 100 µs 0.000231 @ 3.08</w:t>
+        <w:t>mujoco: 10 ms 1.66 @ 0.04, 5 ms 0.849 @ 0.09, 2 ms 0.346 @ 0.21, 1 ms 0.191 @ 0.41, 500 µs 0.0858 @ 0.77, 100 µs 0.000375 @ 3.11</w:t>
       </w:r>
     </w:p>
     <w:p>
@@ -16721,7 +16705,7 @@
         <w:pStyle w:val="ListBullet"/>
       </w:pPr>
       <w:r>
-        <w:t>mujoco-adaptive: ε=0.1 1.05 @ 0.15, ε=0.01 0.623 @ 0.15, ε=0.001 0.184 @ 0.28, ε=0.0001 0.0962 @ 0.54, ε=1e-05 0.0448 @ 1.16</w:t>
+        <w:t>mujoco-adaptive: ε=0.1 0.85 @ 0.14, ε=0.01 0.475 @ 0.14, ε=0.001 0.218 @ 0.19, ε=0.0001 0.0788 @ 0.37, ε=1e-05 0.0278 @ 0.85</w:t>
       </w:r>
     </w:p>
     <w:p>
@@ -16729,7 +16713,7 @@
         <w:pStyle w:val="ListBullet"/>
       </w:pPr>
       <w:r>
-        <w:t>icf: 10 ms 3.66 @ 0.17, 5 ms 1.89 @ 0.26, 2 ms 0.729 @ 0.58, 1 ms 0.287 @ 1.00, 500 µs 0.117 @ 1.85, 100 µs 0.0106 @ 7.16</w:t>
+        <w:t>icf: 10 ms 5.24 @ 0.18, 5 ms 3.77 @ 0.30, 2 ms 2.33 @ 0.61, 1 ms 1.32 @ 1.06, 500 µs 0.622 @ 1.86, 100 µs 0.0047 @ 7.63</w:t>
       </w:r>
     </w:p>
     <w:p>
@@ -16737,7 +16721,7 @@
         <w:pStyle w:val="ListBullet"/>
       </w:pPr>
       <w:r>
-        <w:t>icf-adaptive: ε=0.1 1.84 @ 0.34, ε=0.01 1.21 @ 0.41, ε=0.001 0.391 @ 0.45, ε=0.0001 0.137 @ 1.38, ε=1e-05 0.0413 @ 3.16</w:t>
+        <w:t>icf-adaptive: ε=0.1 3.56 @ 0.38, ε=0.01 3.02 @ 0.43, ε=0.001 1.8 @ 0.89, ε=0.0001 0.641 @ 2.05, ε=1e-05 0.153 @ 4.52</w:t>
       </w:r>
     </w:p>
     <w:p>
@@ -16753,7 +16737,7 @@
         <w:pStyle w:val="ListBullet"/>
       </w:pPr>
       <w:r>
-        <w:t>mujoco: 64: 4.66, 128: 4.74, 256: 5.09, 512: 5.91, 1024: 7.85, 2048: 13.8, 4096: 24.2, 8192: 45.2 → per world at 8192: 6 µs</w:t>
+        <w:t>mujoco: 64: 4.63, 128: 4.7, 256: 5.04, 512: 5.89, 1024: 7.79, 2048: 13.7, 4096: 24, 8192: 44.9 → per world at 8192: 5 µs</w:t>
       </w:r>
     </w:p>
     <w:p>
@@ -16761,7 +16745,7 @@
         <w:pStyle w:val="ListBullet"/>
       </w:pPr>
       <w:r>
-        <w:t>mujoco-adaptive: 64: 28.4, 128: 29.6, 256: 32.5, 512: 37.2, 1024: 50.2, 2048: 83.2, 4096: 139, 8192: 281 → per world at 8192: 34 µs</w:t>
+        <w:t>mujoco-adaptive: 64: 26.2, 128: 26.8, 256: 30.7, 512: 35.1, 1024: 45.4, 2048: 73.5, 4096: 122, 8192: 222 → per world at 8192: 27 µs</w:t>
       </w:r>
     </w:p>
     <w:p>
@@ -16769,7 +16753,7 @@
         <w:pStyle w:val="ListBullet"/>
       </w:pPr>
       <w:r>
-        <w:t>icf: 64: 36, 128: 54.3, 256: 85.6, 512: 153, 1024: 317, 2048: 629, 4096: 1.27e+03, 8192: 2.5e+03 → per world at 8192: 305 µs</w:t>
+        <w:t>icf: 64: 33.7, 128: 51.6, 256: 79.8, 512: 143, 1024: 293, 2048: 588, 4096: 1.18e+03, 8192: 2.33e+03 → per world at 8192: 284 µs</w:t>
       </w:r>
     </w:p>
     <w:p>
@@ -16777,7 +16761,7 @@
         <w:pStyle w:val="ListBullet"/>
       </w:pPr>
       <w:r>
-        <w:t>icf-adaptive: 64: 107, 128: 145, 256: 219, 512: 398, 1024: 729, 2048: 1.46e+03, 4096: 2.86e+03, 8192: 5.58e+03 → per world at 8192: 681 µs</w:t>
+        <w:t>icf-adaptive: 64: 121, 128: 183, 256: 268, 512: 454, 1024: 835, 2048: 1.61e+03, 4096: 3.15e+03, 8192: 6.22e+03 → per world at 8192: 759 µs</w:t>
       </w:r>
     </w:p>
     <w:p>
@@ -16865,7 +16849,7 @@
         <w:pStyle w:val="ListBullet"/>
       </w:pPr>
       <w:r>
-        <w:t>mujoco 1 ms: 1e+03: 0.73, 1e+04: 0.98, 1e+05: 0.98, 1e+06: 6.81, 1e+07: 68.15, 1e+08: 681.45</w:t>
+        <w:t>mujoco 1 ms: 1e+03: 1.00, 1e+04: 1.29, 1e+05: 0.98, 1e+06: 6.81, 1e+07: 68.15, 1e+08: 681.45</w:t>
       </w:r>
     </w:p>
     <w:p>
@@ -16873,7 +16857,7 @@
         <w:pStyle w:val="ListBullet"/>
       </w:pPr>
       <w:r>
-        <w:t>mujoco 10 ms: 1e+03: 0.73, 1e+04: 5.72, 1e+05: 57.19, 1e+06: 571.88, 1e+07: 5718.80, 1e+08: 57188.04</w:t>
+        <w:t>mujoco 10 ms: 1e+03: 1.00, 1e+04: 5.72, 1e+05: 57.19, 1e+06: 571.88, 1e+07: 5718.80, 1e+08: 57188.04</w:t>
       </w:r>
     </w:p>
     <w:p>
@@ -16881,7 +16865,7 @@
         <w:pStyle w:val="ListBullet"/>
       </w:pPr>
       <w:r>
-        <w:t>mujoco-adaptive ε=0.001: 1e+03: 0.73, 1e+04: 1.68, 1e+05: 16.78, 1e+06: 167.82, 1e+07: 1678.22, 1e+08: 16782.18</w:t>
+        <w:t>mujoco-adaptive ε=0.001: 1e+03: 1.00, 1e+04: 1.68, 1e+05: 16.78, 1e+06: 167.82, 1e+07: 1678.22, 1e+08: 16782.18</w:t>
       </w:r>
     </w:p>
     <w:p>
@@ -16889,7 +16873,7 @@
         <w:pStyle w:val="ListBullet"/>
       </w:pPr>
       <w:r>
-        <w:t>mujoco-adaptive ε=1e-05: 1e+03: 0.73, 1e+04: 0.98, 1e+05: 1.25, 1e+06: 15.73, 1e+07: 178.65, 1e+08: 1786.46</w:t>
+        <w:t>mujoco-adaptive ε=1e-05: 1e+03: 1.00, 1e+04: 1.29, 1e+05: 1.25, 1e+06: 15.13, 1e+07: 178.65, 1e+08: 1786.46</w:t>
       </w:r>
     </w:p>
     <w:p>
@@ -16929,7 +16913,7 @@
         <w:pStyle w:val="ListBullet"/>
       </w:pPr>
       <w:r>
-        <w:t>icf: lift -0.02…-0.02 mm; rel. vel at K_p=1e5: 10 ms 0.000, 5 ms 0.083, 2 ms 0.202, 1 ms 0.269</w:t>
+        <w:t>icf: lift -0.02…-0.02 mm; rel. vel at K_p=1e5: 10 ms 0.000, 5 ms 0.083, 2 ms 0.204, 1 ms 0.276</w:t>
       </w:r>
     </w:p>
     <w:p>
@@ -16937,7 +16921,47 @@
         <w:pStyle w:val="ListBullet"/>
       </w:pPr>
       <w:r>
-        <w:t>icf-adaptive: lift -0.02…-0.02 mm; rel. vel at K_p=1e5: ε=0.1 0.083, ε=0.01 0.083, ε=0.001 0.083, ε=0.0001 0.255</w:t>
+        <w:t>icf-adaptive: lift -0.02…-0.02 mm; rel. vel at K_p=1e5: ε=0.1 0.083, ε=0.01 0.083, ε=0.001 0.083, ε=0.0001 0.265</w:t>
+      </w:r>
+    </w:p>
+    <w:p>
+      <w:pPr>
+        <w:pStyle w:val="Heading2"/>
+      </w:pPr>
+      <w:r>
+        <w:t>actuated regime throughput (heterogeneous worlds)</w:t>
+      </w:r>
+    </w:p>
+    <w:p>
+      <w:pPr>
+        <w:pStyle w:val="ListBullet"/>
+      </w:pPr>
+      <w:r>
+        <w:t>mujoco: N=64: 2.57 ms/boundary, 10 steps, N=256: 3.04 ms/boundary, 10 steps, N=1024: 3.58 ms/boundary, 10 steps, N=4096: 5.07 ms/boundary, 10 steps</w:t>
+      </w:r>
+    </w:p>
+    <w:p>
+      <w:pPr>
+        <w:pStyle w:val="ListBullet"/>
+      </w:pPr>
+      <w:r>
+        <w:t>mujoco-adaptive: N=64: 2.69 ms/boundary, 5.06 steps, N=256: 3.14 ms/boundary, 6.06 steps, N=1024: 5.98 ms/boundary, 7.43 steps, N=4096: 12.9 ms/boundary, 8.54 steps</w:t>
+      </w:r>
+    </w:p>
+    <w:p>
+      <w:pPr>
+        <w:pStyle w:val="ListBullet"/>
+      </w:pPr>
+      <w:r>
+        <w:t>icf: N=64: 1.99 ms/boundary, 10 steps, N=256: 2.31 ms/boundary, 10 steps, N=1024: 2.63 ms/boundary, 10 steps, N=4096: 3.52 ms/boundary, 10 steps</w:t>
+      </w:r>
+    </w:p>
+    <w:p>
+      <w:pPr>
+        <w:pStyle w:val="ListBullet"/>
+      </w:pPr>
+      <w:r>
+        <w:t>icf-adaptive: N=64: 0.884 ms/boundary, 1 steps, N=256: 1.02 ms/boundary, 1 steps, N=1024: 1.22 ms/boundary, 1 steps, N=4096: 1.59 ms/boundary, 1 steps</w:t>
       </w:r>
     </w:p>
     <w:sectPr>

</xml_diff>

<commit_message>
Record the Part-1 trim in the working notebook (B30)
Appends the dated supersession the notebook's convention uses: the four
core experiments as Part 1's entire presentation, the retired benches
and purged files, the render laws, the re-verified tau(k) calibration
chain, and the updated Results-I skeleton and repo map.
</commit_message>
<xml_diff>
--- a/paper/CENIC_working_notebook.docx
+++ b/paper/CENIC_working_notebook.docx
@@ -7059,6 +7059,87 @@
       </w:r>
     </w:p>
     <w:p>
+      <w:pPr>
+        <w:pStyle w:val="Heading1"/>
+      </w:pPr>
+      <w:r>
+        <w:t>B30. 2026-08-31 - Part 1 trimmed to the four core experiments (Marco's ruling: 'anything that isnt core is gone'; overrides the Part-1 structure in B2-B16, C.IV and D3 wherever they disagree)</w:t>
+      </w:r>
+    </w:p>
+    <w:p>
+      <w:r>
+        <w:rPr>
+          <w:b/>
+          <w:i w:val="0"/>
+        </w:rPr>
+        <w:t>Part 1's entire presentation is now ONE document, 'P1_core_experiments' in the Drive folder ICRA 2027/Part 1 (every other P1 Drive doc trashed: figure guide, constants, key numbers, figures-with-captions). Four experiments, each with: a render of exactly the scene the plot uses, a figure, a plain-prose explanation that assumes the reader knows nothing, and GitHub line citations pinned at commit c0279e47d8fe. Prose laws in force: no em dashes; no mechanism vocabulary (joint/gantry/carriage/actuator) - the PD is explained only as the scene's virtual spring pulling the fingertip toward a commanded point; MuJoCo is never described as having a single k (solref time constant per effective mass, refsafe clamp, two-anchor measured calibration); a legend entry must be a visible curve (the four coinciding ICF lines of the stiffness figure collapsed to one labeled entry).</w:t>
+      </w:r>
+    </w:p>
+    <w:p>
+      <w:pPr>
+        <w:pStyle w:val="ListBullet"/>
+      </w:pPr>
+      <w:r>
+        <w:t>The four core experiments: (1) Realized contact stiffness (B3's figure; ICF lines collapsed); (2) Work-precision at matched tolerance, hard clutter, N=1 and N=1024 (B5's figure); (3) Wall time vs number of worlds, hard clutter (B8's figure); (4) The actuated PD push (B12's stability/box-behaviour figure) plus the heterogeneous-gain throughput figure (actuated_scaling - the one throughput plot CENIC wins outright).</w:t>
+      </w:r>
+    </w:p>
+    <w:p>
+      <w:pPr>
+        <w:pStyle w:val="ListBullet"/>
+      </w:pPr>
+      <w:r>
+        <w:t>Retired from the paper's Part 1 (not from the record): ball energy (B4), artifacts/penetration-vs-cost (B6), real-time trace (B7), consistency (B9). Their CSVs remain committed and their headline numbers remain quotable via D1 and Appendix I; their bench scripts are DELETED.</w:t>
+      </w:r>
+    </w:p>
+    <w:p>
+      <w:pPr>
+        <w:pStyle w:val="ListBullet"/>
+      </w:pPr>
+      <w:r>
+        <w:t>Dead code purged (git rm at c0279e47d8fe, recoverable from history): part1_{ball_energy, consistency, convergence, penetration, realtime_trace}.py, the legacy benchmarks {accuracy, dt_comparison, initial_conditions, scaling, _single_iter, timeline}.py, part1_story.py, part1_tables.py, part1_results_md.py, verify_part1_penetration.py, runner.py, __main__.py. B16's 'delete or park part1_convergence.py' is resolved: deleted.</w:t>
+      </w:r>
+    </w:p>
+    <w:p>
+      <w:pPr>
+        <w:pStyle w:val="ListBullet"/>
+      </w:pPr>
+      <w:r>
+        <w:t>Kept and load-bearing: the four core benches + part1_actuated_scaling.py, part1_plots.py (only workprecision/scaling/stiffness_sweep/actuated/actuated_scaling remain), part1_scenes_figure.py (all renders incl. the two schematics), the probes (march_cost, momentum, determinism, floor_occupancy, mujoco_cone, actuated_trace), verify_contact_budgets.py, part1_keynumbers.py (Appendix I), all results CSVs.</w:t>
+      </w:r>
+    </w:p>
+    <w:p>
+      <w:pPr>
+        <w:pStyle w:val="ListBullet"/>
+      </w:pPr>
+      <w:r>
+        <w:t>Renders (supersedes B2's description): every render shows ONLY the scenes its figure plots, one row per scene with initial and settled states SIDE BY SIDE (stacked panels squash in Google's viewer); clutter bodies are shaded with edges and a cutaway bin so piles read as distinct bodies; the stiffness ball is gridded; the actuated schematic is a near-side force diagram (fingertip, stretched virtual spring, commanded point at the box face, descend path, slide arrow) frozen just before contact, marked not-to-scale (the drawn tip-to-box gap is widened from the scene's 2 cm for legibility). Render commits: e4dd057, 0b1be73, 44acd08.</w:t>
+      </w:r>
+    </w:p>
+    <w:p>
+      <w:pPr>
+        <w:pStyle w:val="ListBullet"/>
+      </w:pPr>
+      <w:r>
+        <w:t>The tau(k) conversion behind Exp 1 and Exp 4, re-verified against the committed CSV this day: two measured anchors (tau = 31.8 ms at k = 1e3, 2.4 ms at 1e5), exponent b = log(31.8/2.4)/log(100) = -0.56 between them (pure 1/sqrt(k) had left a 1.37x offset). End to end in part1_stiffness_sweep.csv: ratio pen/(mg/k) = 0.998 at k = 1e3 (10 ms AND 1 ms) and 0.981 at k = 1e5 (1 ms) - the anchors deliver the requested k within 2 % where MuJoCo can express it; between anchors (k = 1e4, 1 ms) the interpolation reads 1.29, an honest ~30 % gap; every clamped cell is reported as MEASURED, never converted. The actuated bench uses the same anchor only AT k = 1e5 (no extrapolation).</w:t>
+      </w:r>
+    </w:p>
+    <w:p>
+      <w:pPr>
+        <w:pStyle w:val="ListBullet"/>
+      </w:pPr>
+      <w:r>
+        <w:t>D2's 'which Part-1 figures fit the page budget' is resolved by this trim: the four core figures plus their renders.</w:t>
+      </w:r>
+    </w:p>
+    <w:p>
+      <w:pPr>
+        <w:pStyle w:val="ListBullet"/>
+      </w:pPr>
+      <w:r>
+        <w:t>Part 2 documentation state: the Drive 'Part 2 constants and comparisons' doc is STALE against the 2026-08-31 instrument revisions (slide held-delivery economy, plate orientation-free gate, flip/tree success from the task_complete termination) - open item, next in queue.</w:t>
+      </w:r>
+    </w:p>
+    <w:p>
       <w:r>
         <w:br w:type="page"/>
       </w:r>
@@ -7946,7 +8027,7 @@
         <w:pStyle w:val="Heading1"/>
       </w:pPr>
       <w:r>
-        <w:t>IV. Results I — pure solver</w:t>
+        <w:t>IV. Results I — pure solver (trimmed 2026-08-31 to the four core experiments, B30)</w:t>
       </w:r>
     </w:p>
     <w:p>
@@ -7993,7 +8074,7 @@
         <w:pStyle w:val="ListBullet"/>
       </w:pPr>
       <w:r>
-        <w:t>MuJoCo calibration and the soft-clutter offset (B13, B3)</w:t>
+        <w:t>MuJoCo calibration: two measured anchors, no single k (B13, B3, B30)</w:t>
       </w:r>
     </w:p>
     <w:p>
@@ -8010,7 +8091,7 @@
         <w:pStyle w:val="ListBullet"/>
       </w:pPr>
       <w:r>
-        <w:t>cenic_scenes.py</w:t>
+        <w:t>part1/scenes/cenic_scenes.py</w:t>
       </w:r>
     </w:p>
     <w:p>
@@ -8018,7 +8099,7 @@
         <w:pStyle w:val="ListBullet"/>
       </w:pPr>
       <w:r>
-        <w:t>figures/scenes.pdf</w:t>
+        <w:t>renders in part1/bench/results/figures/</w:t>
       </w:r>
     </w:p>
     <w:p>
@@ -8069,7 +8150,7 @@
         <w:pStyle w:val="Heading2"/>
       </w:pPr>
       <w:r>
-        <w:t>Realized stiffness</w:t>
+        <w:t>Exp 1 — Realized stiffness</w:t>
       </w:r>
     </w:p>
     <w:p>
@@ -8100,7 +8181,7 @@
         <w:pStyle w:val="ListBullet"/>
       </w:pPr>
       <w:r>
-        <w:t>What each solver realizes at 10 ms / 1 ms / EC (B3)</w:t>
+        <w:t>What each solver realizes at 10 ms / 1 ms / EC (B3); ICF lines collapsed to one legend entry</w:t>
       </w:r>
     </w:p>
     <w:p>
@@ -8117,7 +8198,7 @@
         <w:pStyle w:val="ListBullet"/>
       </w:pPr>
       <w:r>
-        <w:t>figures/stiffness_sweep.pdf</w:t>
+        <w:t>figures/stiffness_sweep.pdf; render scene_stiffness</w:t>
       </w:r>
     </w:p>
     <w:p>
@@ -8168,7 +8249,7 @@
         <w:pStyle w:val="Heading2"/>
       </w:pPr>
       <w:r>
-        <w:t>Energy convergence</w:t>
+        <w:t>Exp 2 — Work-precision at matched tolerance</w:t>
       </w:r>
     </w:p>
     <w:p>
@@ -8199,7 +8280,7 @@
         <w:pStyle w:val="ListBullet"/>
       </w:pPr>
       <w:r>
-        <w:t>Orders; the honest ordering; the MuJoCo-EC gain (B4)</w:t>
+        <w:t>Cost vs requested accuracy at N=1 and N=1024; per-attempt cost (B5, B15)</w:t>
       </w:r>
     </w:p>
     <w:p>
@@ -8216,7 +8297,7 @@
         <w:pStyle w:val="ListBullet"/>
       </w:pPr>
       <w:r>
-        <w:t>figures/ball_energy.pdf, ball_workprecision.pdf</w:t>
+        <w:t>figures/workprecision.pdf; render scenes_clutter</w:t>
       </w:r>
     </w:p>
     <w:p>
@@ -8267,7 +8348,7 @@
         <w:pStyle w:val="Heading2"/>
       </w:pPr>
       <w:r>
-        <w:t>Work-precision</w:t>
+        <w:t>Exp 3 — Wall time vs number of worlds</w:t>
       </w:r>
     </w:p>
     <w:p>
@@ -8298,7 +8379,7 @@
         <w:pStyle w:val="ListBullet"/>
       </w:pPr>
       <w:r>
-        <w:t>Cost vs requested accuracy; per-attempt cost (B5, B15)</w:t>
+        <w:t>Per-world cost at 2^13; the ICF/MuJoCo ratio (B8)</w:t>
       </w:r>
     </w:p>
     <w:p>
@@ -8315,7 +8396,7 @@
         <w:pStyle w:val="ListBullet"/>
       </w:pPr>
       <w:r>
-        <w:t>figures/workprecision.pdf, speed_bars.pdf; tables/part1_table1.md</w:t>
+        <w:t>figures/scaling_hard-clutter.pdf; render scene_hard_clutter</w:t>
       </w:r>
     </w:p>
     <w:p>
@@ -8366,7 +8447,7 @@
         <w:pStyle w:val="Heading2"/>
       </w:pPr>
       <w:r>
-        <w:t>Contact artifacts vs cost</w:t>
+        <w:t>Exp 4 — Actuated PD push + heterogeneous-gain throughput</w:t>
       </w:r>
     </w:p>
     <w:p>
@@ -8397,7 +8478,7 @@
         <w:pStyle w:val="ListBullet"/>
       </w:pPr>
       <w:r>
-        <w:t>Cheapest artifact-free per arm; who ejects (B6)</w:t>
+        <w:t>Stability map; the pushed box; what 10 ms hides; the one throughput plot CENIC wins (B12)</w:t>
       </w:r>
     </w:p>
     <w:p>
@@ -8414,7 +8495,7 @@
         <w:pStyle w:val="ListBullet"/>
       </w:pPr>
       <w:r>
-        <w:t>figures/artifacts.pdf</w:t>
+        <w:t>figures/actuated.pdf, actuated_scaling.pdf; render scene_actuated</w:t>
       </w:r>
     </w:p>
     <w:p>
@@ -8461,399 +8542,12 @@
       </w:r>
     </w:p>
     <w:p>
-      <w:pPr>
-        <w:pStyle w:val="Heading2"/>
-      </w:pPr>
-      <w:r>
-        <w:t>Error control pays when something happens</w:t>
-      </w:r>
-    </w:p>
-    <w:p>
-      <w:r>
-        <w:rPr>
-          <w:b/>
-          <w:i w:val="0"/>
-        </w:rPr>
-        <w:t xml:space="preserve">Purpose (one sentence, yours): </w:t>
-      </w:r>
-    </w:p>
-    <w:p>
-      <w:r>
-        <w:t>_______________________________________________________________________________________________</w:t>
-      </w:r>
-    </w:p>
-    <w:p>
-      <w:r>
-        <w:rPr>
-          <w:b/>
-          <w:i w:val="0"/>
-        </w:rPr>
-        <w:t>Questions this section has to answer:</w:t>
-      </w:r>
-    </w:p>
-    <w:p>
-      <w:pPr>
-        <w:pStyle w:val="ListBullet"/>
-      </w:pPr>
-      <w:r>
-        <w:t>Where the saving is (B7)</w:t>
-      </w:r>
-    </w:p>
-    <w:p>
-      <w:r>
-        <w:rPr>
-          <w:b/>
-          <w:i w:val="0"/>
-        </w:rPr>
-        <w:t>Evidence on hand (pointers):</w:t>
-      </w:r>
-    </w:p>
-    <w:p>
-      <w:pPr>
-        <w:pStyle w:val="ListBullet"/>
-      </w:pPr>
-      <w:r>
-        <w:t>figures/realtime_trace_n64.pdf</w:t>
-      </w:r>
-    </w:p>
-    <w:p>
-      <w:r>
-        <w:rPr>
-          <w:b/>
-          <w:i w:val="0"/>
-        </w:rPr>
-        <w:t>Your notes / draft:</w:t>
-      </w:r>
-    </w:p>
-    <w:p>
-      <w:r>
-        <w:t>_______________________________________________________________________________________________</w:t>
-      </w:r>
-    </w:p>
-    <w:p>
-      <w:r>
-        <w:t>_______________________________________________________________________________________________</w:t>
-      </w:r>
-    </w:p>
-    <w:p>
-      <w:r>
-        <w:t>_______________________________________________________________________________________________</w:t>
-      </w:r>
-    </w:p>
-    <w:p>
-      <w:r>
-        <w:t>_______________________________________________________________________________________________</w:t>
-      </w:r>
-    </w:p>
-    <w:p>
-      <w:r>
-        <w:t>_______________________________________________________________________________________________</w:t>
-      </w:r>
-    </w:p>
-    <w:p>
       <w:r>
         <w:rPr>
           <w:b w:val="0"/>
           <w:i/>
         </w:rPr>
-        <w:t>Status:  ☐ outlined   ☐ drafted   ☐ figures placed   ☐ read by Vince   ☐ done</w:t>
-      </w:r>
-    </w:p>
-    <w:p>
-      <w:pPr>
-        <w:pStyle w:val="Heading2"/>
-      </w:pPr>
-      <w:r>
-        <w:t>Measured error vs cost</w:t>
-      </w:r>
-    </w:p>
-    <w:p>
-      <w:r>
-        <w:rPr>
-          <w:b/>
-          <w:i w:val="0"/>
-        </w:rPr>
-        <w:t xml:space="preserve">Purpose (one sentence, yours): </w:t>
-      </w:r>
-    </w:p>
-    <w:p>
-      <w:r>
-        <w:t>_______________________________________________________________________________________________</w:t>
-      </w:r>
-    </w:p>
-    <w:p>
-      <w:r>
-        <w:rPr>
-          <w:b/>
-          <w:i w:val="0"/>
-        </w:rPr>
-        <w:t>Questions this section has to answer:</w:t>
-      </w:r>
-    </w:p>
-    <w:p>
-      <w:pPr>
-        <w:pStyle w:val="ListBullet"/>
-      </w:pPr>
-      <w:r>
-        <w:t>The floor; where EC beats fixed at matched measured error (B9, B10)</w:t>
-      </w:r>
-    </w:p>
-    <w:p>
-      <w:r>
-        <w:rPr>
-          <w:b/>
-          <w:i w:val="0"/>
-        </w:rPr>
-        <w:t>Evidence on hand (pointers):</w:t>
-      </w:r>
-    </w:p>
-    <w:p>
-      <w:pPr>
-        <w:pStyle w:val="ListBullet"/>
-      </w:pPr>
-      <w:r>
-        <w:t>figures/consistency.pdf; tables/determinism_probe.md</w:t>
-      </w:r>
-    </w:p>
-    <w:p>
-      <w:r>
-        <w:rPr>
-          <w:b/>
-          <w:i w:val="0"/>
-        </w:rPr>
-        <w:t>Your notes / draft:</w:t>
-      </w:r>
-    </w:p>
-    <w:p>
-      <w:r>
-        <w:t>_______________________________________________________________________________________________</w:t>
-      </w:r>
-    </w:p>
-    <w:p>
-      <w:r>
-        <w:t>_______________________________________________________________________________________________</w:t>
-      </w:r>
-    </w:p>
-    <w:p>
-      <w:r>
-        <w:t>_______________________________________________________________________________________________</w:t>
-      </w:r>
-    </w:p>
-    <w:p>
-      <w:r>
-        <w:t>_______________________________________________________________________________________________</w:t>
-      </w:r>
-    </w:p>
-    <w:p>
-      <w:r>
-        <w:t>_______________________________________________________________________________________________</w:t>
-      </w:r>
-    </w:p>
-    <w:p>
-      <w:r>
-        <w:rPr>
-          <w:b w:val="0"/>
-          <w:i/>
-        </w:rPr>
-        <w:t>Status:  ☐ outlined   ☐ drafted   ☐ figures placed   ☐ read by Vince   ☐ done</w:t>
-      </w:r>
-    </w:p>
-    <w:p>
-      <w:pPr>
-        <w:pStyle w:val="Heading2"/>
-      </w:pPr>
-      <w:r>
-        <w:t>Wall vs worlds</w:t>
-      </w:r>
-    </w:p>
-    <w:p>
-      <w:r>
-        <w:rPr>
-          <w:b/>
-          <w:i w:val="0"/>
-        </w:rPr>
-        <w:t xml:space="preserve">Purpose (one sentence, yours): </w:t>
-      </w:r>
-    </w:p>
-    <w:p>
-      <w:r>
-        <w:t>_______________________________________________________________________________________________</w:t>
-      </w:r>
-    </w:p>
-    <w:p>
-      <w:r>
-        <w:rPr>
-          <w:b/>
-          <w:i w:val="0"/>
-        </w:rPr>
-        <w:t>Questions this section has to answer:</w:t>
-      </w:r>
-    </w:p>
-    <w:p>
-      <w:pPr>
-        <w:pStyle w:val="ListBullet"/>
-      </w:pPr>
-      <w:r>
-        <w:t>Per-world cost at 2^13; the ICF/MuJoCo ratio (B8)</w:t>
-      </w:r>
-    </w:p>
-    <w:p>
-      <w:r>
-        <w:rPr>
-          <w:b/>
-          <w:i w:val="0"/>
-        </w:rPr>
-        <w:t>Evidence on hand (pointers):</w:t>
-      </w:r>
-    </w:p>
-    <w:p>
-      <w:pPr>
-        <w:pStyle w:val="ListBullet"/>
-      </w:pPr>
-      <w:r>
-        <w:t>figures/scaling_per_world_hard-clutter.pdf</w:t>
-      </w:r>
-    </w:p>
-    <w:p>
-      <w:r>
-        <w:rPr>
-          <w:b/>
-          <w:i w:val="0"/>
-        </w:rPr>
-        <w:t>Your notes / draft:</w:t>
-      </w:r>
-    </w:p>
-    <w:p>
-      <w:r>
-        <w:t>_______________________________________________________________________________________________</w:t>
-      </w:r>
-    </w:p>
-    <w:p>
-      <w:r>
-        <w:t>_______________________________________________________________________________________________</w:t>
-      </w:r>
-    </w:p>
-    <w:p>
-      <w:r>
-        <w:t>_______________________________________________________________________________________________</w:t>
-      </w:r>
-    </w:p>
-    <w:p>
-      <w:r>
-        <w:t>_______________________________________________________________________________________________</w:t>
-      </w:r>
-    </w:p>
-    <w:p>
-      <w:r>
-        <w:t>_______________________________________________________________________________________________</w:t>
-      </w:r>
-    </w:p>
-    <w:p>
-      <w:r>
-        <w:rPr>
-          <w:b w:val="0"/>
-          <w:i/>
-        </w:rPr>
-        <w:t>Status:  ☐ outlined   ☐ drafted   ☐ figures placed   ☐ read by Vince   ☐ done</w:t>
-      </w:r>
-    </w:p>
-    <w:p>
-      <w:pPr>
-        <w:pStyle w:val="Heading2"/>
-      </w:pPr>
-      <w:r>
-        <w:t>Actuated stiff contact</w:t>
-      </w:r>
-    </w:p>
-    <w:p>
-      <w:r>
-        <w:rPr>
-          <w:b/>
-          <w:i w:val="0"/>
-        </w:rPr>
-        <w:t xml:space="preserve">Purpose (one sentence, yours): </w:t>
-      </w:r>
-    </w:p>
-    <w:p>
-      <w:r>
-        <w:t>_______________________________________________________________________________________________</w:t>
-      </w:r>
-    </w:p>
-    <w:p>
-      <w:r>
-        <w:rPr>
-          <w:b/>
-          <w:i w:val="0"/>
-        </w:rPr>
-        <w:t>Questions this section has to answer:</w:t>
-      </w:r>
-    </w:p>
-    <w:p>
-      <w:pPr>
-        <w:pStyle w:val="ListBullet"/>
-      </w:pPr>
-      <w:r>
-        <w:t>Stability map; the pushed box; what 10 ms hides (B12)</w:t>
-      </w:r>
-    </w:p>
-    <w:p>
-      <w:r>
-        <w:rPr>
-          <w:b/>
-          <w:i w:val="0"/>
-        </w:rPr>
-        <w:t>Evidence on hand (pointers):</w:t>
-      </w:r>
-    </w:p>
-    <w:p>
-      <w:pPr>
-        <w:pStyle w:val="ListBullet"/>
-      </w:pPr>
-      <w:r>
-        <w:t>figures/actuated.pdf, actuated_chatter.pdf</w:t>
-      </w:r>
-    </w:p>
-    <w:p>
-      <w:r>
-        <w:rPr>
-          <w:b/>
-          <w:i w:val="0"/>
-        </w:rPr>
-        <w:t>Your notes / draft:</w:t>
-      </w:r>
-    </w:p>
-    <w:p>
-      <w:r>
-        <w:t>_______________________________________________________________________________________________</w:t>
-      </w:r>
-    </w:p>
-    <w:p>
-      <w:r>
-        <w:t>_______________________________________________________________________________________________</w:t>
-      </w:r>
-    </w:p>
-    <w:p>
-      <w:r>
-        <w:t>_______________________________________________________________________________________________</w:t>
-      </w:r>
-    </w:p>
-    <w:p>
-      <w:r>
-        <w:t>_______________________________________________________________________________________________</w:t>
-      </w:r>
-    </w:p>
-    <w:p>
-      <w:r>
-        <w:t>_______________________________________________________________________________________________</w:t>
-      </w:r>
-    </w:p>
-    <w:p>
-      <w:r>
-        <w:rPr>
-          <w:b w:val="0"/>
-          <w:i/>
-        </w:rPr>
-        <w:t>Status:  ☐ outlined   ☐ drafted   ☐ figures placed   ☐ read by Vince   ☐ done</w:t>
+        <w:t>Retired from Results I by the 2026-08-31 trim (B30): energy convergence, artifacts vs cost, real-time trace, consistency. Numbers stay quotable from the CSVs (D1, Appendix I); the benches are deleted.</w:t>
       </w:r>
     </w:p>
     <w:p>
@@ -11056,7 +10750,7 @@
         <w:pStyle w:val="ListBullet"/>
       </w:pPr>
       <w:r>
-        <w:t>☐ Which Part-1 figures fit the page budget (24 PDFs exist)</w:t>
+        <w:t>☑ Which Part-1 figures fit the page budget — RESOLVED 2026-08-31 (B30): the four core figures plus their renders, nothing else</w:t>
       </w:r>
     </w:p>
     <w:p>
@@ -11246,7 +10940,7 @@
           </w:tcPr>
           <w:p>
             <w:r>
-              <w:t>Part-1 benches</w:t>
+              <w:t>Part-1 benches (post-trim, B30)</w:t>
             </w:r>
           </w:p>
         </w:tc>
@@ -11256,7 +10950,7 @@
           </w:tcPr>
           <w:p>
             <w:r>
-              <w:t>part1/bench/benchmarks/part1_{workprecision, penetration, scaling, ball_energy, realtime_trace, consistency, stiffness_sweep, actuated}.py</w:t>
+              <w:t>part1/bench/benchmarks/part1_{stiffness_sweep, workprecision, scaling, actuated, actuated_scaling}.py</w:t>
             </w:r>
           </w:p>
         </w:tc>
@@ -11288,7 +10982,7 @@
           </w:tcPr>
           <w:p>
             <w:r>
-              <w:t>part1/bench/probe_momentum.py, probe_determinism.py, probe_actuated_trace.py, probe_march_cost.py, verify_contact_budgets.py, verify_part1_penetration.py; part1_consistency.py --self-check</w:t>
+              <w:t>part1/bench/probe_{momentum, determinism, actuated_trace, march_cost, floor_occupancy, mujoco_cone}.py, verify_contact_budgets.py</w:t>
             </w:r>
           </w:p>
         </w:tc>
@@ -11310,7 +11004,7 @@
           </w:tcPr>
           <w:p>
             <w:r>
-              <w:t>Figures / tables</w:t>
+              <w:t>Figures / renders</w:t>
             </w:r>
           </w:p>
         </w:tc>
@@ -11320,7 +11014,7 @@
           </w:tcPr>
           <w:p>
             <w:r>
-              <w:t>part1/bench/part1_plots.py; part1_tables.py; part1_results_md.py; part1_scenes_figure.py</w:t>
+              <w:t>part1/bench/part1_plots.py (workprecision/scaling/stiffness_sweep/actuated/actuated_scaling); part1_scenes_figure.py (all renders + the two schematics)</w:t>
             </w:r>
           </w:p>
         </w:tc>
@@ -11330,7 +11024,7 @@
           </w:tcPr>
           <w:p>
             <w:r>
-              <w:t>CPU only; regenerate after any sweep</w:t>
+              <w:t>plots CPU only; the scene renders settle on the GPU; regenerate after any sweep</w:t>
             </w:r>
           </w:p>
         </w:tc>
@@ -11480,7 +11174,7 @@
           </w:tcPr>
           <w:p>
             <w:r>
-              <w:t>~/Documents/code/cenic-paper (conference_101719.tex verbatim, main.tex outline, figures/, references.bib, this notebook, tools/make_notebook.py)</w:t>
+              <w:t>icra2027/paper (main.tex outline, figures/, references.bib, this notebook, tools/make_notebook.py); the P1 deliverable is the Drive doc 'P1_core_experiments' (Part 1 folder)</w:t>
             </w:r>
           </w:p>
         </w:tc>
@@ -11490,7 +11184,7 @@
           </w:tcPr>
           <w:p>
             <w:r>
-              <w:t>upload cenic-paper.zip to Overleaf; regenerate the notebook with PYTHONPATH=&lt;pylib&gt; python tools/make_notebook.py</w:t>
+              <w:t>regenerate the notebook with PYTHONPATH=&lt;pylib&gt; python paper/tools/make_notebook.py from the icra2027 root</w:t>
             </w:r>
           </w:p>
         </w:tc>

</xml_diff>

<commit_message>
Ship the re-cast Experiment 1 in the doc and notebook (B31)
</commit_message>
<xml_diff>
--- a/paper/CENIC_working_notebook.docx
+++ b/paper/CENIC_working_notebook.docx
@@ -7140,6 +7140,62 @@
       </w:r>
     </w:p>
     <w:p>
+      <w:pPr>
+        <w:pStyle w:val="Heading1"/>
+      </w:pPr>
+      <w:r>
+        <w:t>B31. 2026-08-31 (later) - Experiment 1 re-cast on penetration vs step and vs tolerance (supersedes B3 and B30's Exp-1 lines; ordered after the PI's solref objection: 'any physical system can be represented in solref, it is about penetration vs dt and vs accuracy')</w:t>
+      </w:r>
+    </w:p>
+    <w:p>
+      <w:pPr>
+        <w:pStyle w:val="ListBullet"/>
+      </w:pPr>
+      <w:r>
+        <w:t>The requested-k axis and its fitted tau(k) mapping are DELETED from the bench (48604cf33b). One calibrated system: k = 1e5 N/m, 65 g sphere (k = 1e3 companion rows in the same CSV). Axes: penetration/(m g/k) vs dt in {10, 5, 2, 1, 0.5} ms for the fixed arms, vs eps in {1e-1 .. 1e-5} for error control.</w:t>
+      </w:r>
+    </w:p>
+    <w:p>
+      <w:pPr>
+        <w:pStyle w:val="ListBullet"/>
+      </w:pPr>
+      <w:r>
+        <w:t>MuJoCo appears in BOTH its code forms, read from the installed mujoco_warp constraint.py kbi block (k = 1/(dmax^2 tau^2 zeta^2) at L130; refsafe tau &gt;= 2*dt at L120; direct k when solref[0] &lt;= 0 at L132): the reference solref (calibrated tau = 2.4 ms) and the direct solref (-1.703e5, -632), which self-verifies at fine steps.</w:t>
+      </w:r>
+    </w:p>
+    <w:p>
+      <w:pPr>
+        <w:pStyle w:val="ListBullet"/>
+      </w:pPr>
+      <w:r>
+        <w:t>Equality of systems is established by CONVERGENCE, not parameter translation: all three presentations measure m g/k within 2 % at dt &lt;= 1 ms, and that agreement is visible on the plot itself (the control condition). No conversion, fit, or interpolation exists anywhere in the experiment.</w:t>
+      </w:r>
+    </w:p>
+    <w:p>
+      <w:pPr>
+        <w:pStyle w:val="ListBullet"/>
+      </w:pPr>
+      <w:r>
+        <w:t>Measured (part1_stiffness_sweep.csv, new schema): ICF 1.00 at every step; MuJoCo reference 0.98 at dt &lt;= 1 ms, then 2.7x / 17x / 57x at 2 / 5 / 10 ms, departing exactly at tau/2 = 1.2 ms; MuJoCo direct exact (0.999-1.000) at dt &lt;= 2 ms and LAUNCHED at 5 and 10 ms; soft companion k = 1e3: both solvers 0.998-1.000 at every step including 10 ms. Error control: ICF EC 1.00 at every eps; MuJoCo EC 16.8x flat from eps = 1e-1 through 1e-4, 1.25 at 1e-5 (a position norm does not see self-consistent softening).</w:t>
+      </w:r>
+    </w:p>
+    <w:p>
+      <w:pPr>
+        <w:pStyle w:val="ListBullet"/>
+      </w:pPr>
+      <w:r>
+        <w:t>The talking point the re-cast adds: at the learner's step MuJoCo offers a choice between a softened contact (reference form) and an exploding one (direct form); there is no third setting. ICF's contact does not move with the step.</w:t>
+      </w:r>
+    </w:p>
+    <w:p>
+      <w:pPr>
+        <w:pStyle w:val="ListBullet"/>
+      </w:pPr>
+      <w:r>
+        <w:t>The doc's Experiment 1 is rewritten around this figure (citations re-pinned at 48604cf33b). The old requested-k sweep, its CSV schema and its two-anchor tau(k) fit live only in git history.</w:t>
+      </w:r>
+    </w:p>
+    <w:p>
       <w:r>
         <w:br w:type="page"/>
       </w:r>
@@ -8150,7 +8206,7 @@
         <w:pStyle w:val="Heading2"/>
       </w:pPr>
       <w:r>
-        <w:t>Exp 1 — Realized stiffness</w:t>
+        <w:t>Exp 1 — Penetration vs step and vs tolerance</w:t>
       </w:r>
     </w:p>
     <w:p>
@@ -8181,7 +8237,7 @@
         <w:pStyle w:val="ListBullet"/>
       </w:pPr>
       <w:r>
-        <w:t>What each solver realizes at 10 ms / 1 ms / EC (B3); ICF lines collapsed to one legend entry</w:t>
+        <w:t>One calibrated system (k = 1e5), equality by convergence; MuJoCo in both code forms: clamped reference solref vs unstable literal-k direct solref (B31)</w:t>
       </w:r>
     </w:p>
     <w:p>
@@ -16625,70 +16681,6 @@
       </w:pPr>
       <w:r>
         <w:t>realized stiffness: penetration / (m g/k) vs requested k</w:t>
-      </w:r>
-    </w:p>
-    <w:p>
-      <w:pPr>
-        <w:pStyle w:val="ListBullet"/>
-      </w:pPr>
-      <w:r>
-        <w:t>icf 1 ms: 1e+03: 1.00, 1e+04: 1.00, 1e+05: 1.00, 1e+06: 1.00, 1e+07: 0.99, 1e+08: 0.87</w:t>
-      </w:r>
-    </w:p>
-    <w:p>
-      <w:pPr>
-        <w:pStyle w:val="ListBullet"/>
-      </w:pPr>
-      <w:r>
-        <w:t>icf 10 ms: 1e+03: 1.00, 1e+04: 1.00, 1e+05: 1.00, 1e+06: 1.00, 1e+07: 0.99, 1e+08: 0.87</w:t>
-      </w:r>
-    </w:p>
-    <w:p>
-      <w:pPr>
-        <w:pStyle w:val="ListBullet"/>
-      </w:pPr>
-      <w:r>
-        <w:t>icf-adaptive ε=0.001: 1e+03: 1.00, 1e+04: 1.00, 1e+05: 1.00, 1e+06: 1.00, 1e+07: 0.99, 1e+08: 0.87</w:t>
-      </w:r>
-    </w:p>
-    <w:p>
-      <w:pPr>
-        <w:pStyle w:val="ListBullet"/>
-      </w:pPr>
-      <w:r>
-        <w:t>icf-adaptive ε=1e-05: 1e+03: 1.00, 1e+04: 1.00, 1e+05: 1.00, 1e+06: 1.00, 1e+07: 0.99, 1e+08: 0.87</w:t>
-      </w:r>
-    </w:p>
-    <w:p>
-      <w:pPr>
-        <w:pStyle w:val="ListBullet"/>
-      </w:pPr>
-      <w:r>
-        <w:t>mujoco 1 ms: 1e+03: 1.00, 1e+04: 1.29, 1e+05: 0.98, 1e+06: 6.81, 1e+07: 68.15, 1e+08: 681.45</w:t>
-      </w:r>
-    </w:p>
-    <w:p>
-      <w:pPr>
-        <w:pStyle w:val="ListBullet"/>
-      </w:pPr>
-      <w:r>
-        <w:t>mujoco 10 ms: 1e+03: 1.00, 1e+04: 5.72, 1e+05: 57.19, 1e+06: 571.88, 1e+07: 5718.80, 1e+08: 57188.04</w:t>
-      </w:r>
-    </w:p>
-    <w:p>
-      <w:pPr>
-        <w:pStyle w:val="ListBullet"/>
-      </w:pPr>
-      <w:r>
-        <w:t>mujoco-adaptive ε=0.001: 1e+03: 1.00, 1e+04: 1.68, 1e+05: 16.78, 1e+06: 167.82, 1e+07: 1678.22, 1e+08: 16782.18</w:t>
-      </w:r>
-    </w:p>
-    <w:p>
-      <w:pPr>
-        <w:pStyle w:val="ListBullet"/>
-      </w:pPr>
-      <w:r>
-        <w:t>mujoco-adaptive ε=1e-05: 1e+03: 1.00, 1e+04: 1.29, 1e+05: 1.25, 1e+06: 15.13, 1e+07: 178.65, 1e+08: 1786.46</w:t>
       </w:r>
     </w:p>
     <w:p>

</xml_diff>

<commit_message>
Adapt key-numbers stiffness section to the re-cast CSV schema
</commit_message>
<xml_diff>
--- a/paper/CENIC_working_notebook.docx
+++ b/paper/CENIC_working_notebook.docx
@@ -16680,7 +16680,63 @@
         <w:pStyle w:val="Heading2"/>
       </w:pPr>
       <w:r>
-        <w:t>realized stiffness: penetration / (m g/k) vs requested k</w:t>
+        <w:t>stiffness experiment (one calibrated system per k): penetration / (m g/k) vs dt and vs eps</w:t>
+      </w:r>
+    </w:p>
+    <w:p>
+      <w:pPr>
+        <w:pStyle w:val="ListBullet"/>
+      </w:pPr>
+      <w:r>
+        <w:t>k=1e+05 icf: 0.0005: 1.00, 0.001: 1.00, 0.002: 1.00, 0.005: 1.00, 0.01: 1.00</w:t>
+      </w:r>
+    </w:p>
+    <w:p>
+      <w:pPr>
+        <w:pStyle w:val="ListBullet"/>
+      </w:pPr>
+      <w:r>
+        <w:t>k=1e+05 mujoco: 0.0005: 0.98, 0.001: 0.98, 0.002: 2.72, 0.005: 16.78, 0.01: 57.19</w:t>
+      </w:r>
+    </w:p>
+    <w:p>
+      <w:pPr>
+        <w:pStyle w:val="ListBullet"/>
+      </w:pPr>
+      <w:r>
+        <w:t>k=1e+05 mujoco-direct: 0.0005: 1.00, 0.001: 1.00, 0.002: 1.00, 0.005: UNSTABLE, 0.01: UNSTABLE</w:t>
+      </w:r>
+    </w:p>
+    <w:p>
+      <w:pPr>
+        <w:pStyle w:val="ListBullet"/>
+      </w:pPr>
+      <w:r>
+        <w:t>k=1e+05 icf-adaptive: 1e-05: 1.00, 0.0001: 1.00, 0.001: 1.00, 0.01: 1.00, 0.1: 1.00</w:t>
+      </w:r>
+    </w:p>
+    <w:p>
+      <w:pPr>
+        <w:pStyle w:val="ListBullet"/>
+      </w:pPr>
+      <w:r>
+        <w:t>k=1e+05 mujoco-adaptive: 1e-05: 1.25, 0.0001: 16.78, 0.001: 16.78, 0.01: 16.78, 0.1: 16.78</w:t>
+      </w:r>
+    </w:p>
+    <w:p>
+      <w:pPr>
+        <w:pStyle w:val="ListBullet"/>
+      </w:pPr>
+      <w:r>
+        <w:t>k=1e+03 icf: 0.0005: 1.00, 0.001: 1.00, 0.002: 1.00, 0.005: 1.00, 0.01: 1.00</w:t>
+      </w:r>
+    </w:p>
+    <w:p>
+      <w:pPr>
+        <w:pStyle w:val="ListBullet"/>
+      </w:pPr>
+      <w:r>
+        <w:t>k=1e+03 mujoco: 0.0005: 1.00, 0.001: 1.00, 0.002: 1.00, 0.005: 1.00, 0.01: 1.00</w:t>
       </w:r>
     </w:p>
     <w:p>

</xml_diff>